<commit_message>
finish lab04 && add comprehensive execises data
</commit_message>
<xml_diff>
--- a/labs/lab_report/finished_report/DB实验4+数据库表的维护.docx
+++ b/labs/lab_report/finished_report/DB实验4+数据库表的维护.docx
@@ -1158,14 +1158,7 @@
           <w:rFonts w:hint="eastAsia"/>
           <w:color w:val="000000"/>
         </w:rPr>
-        <w:t>：非空，用于保证该字段的值不</w:t>
-      </w:r>
-      <w:r>
-        <w:rPr>
-          <w:rFonts w:hint="eastAsia"/>
-          <w:color w:val="000000"/>
-        </w:rPr>
-        <w:t>能为空。</w:t>
+        <w:t>：非空，用于保证该字段的值不能为空。</w:t>
       </w:r>
     </w:p>
     <w:p>
@@ -1386,13 +1379,7 @@
         <w:rPr>
           <w:rFonts w:hint="eastAsia"/>
         </w:rPr>
-        <w:t xml:space="preserve">VALUES </w:t>
-      </w:r>
-      <w:r>
-        <w:rPr>
-          <w:rFonts w:hint="eastAsia"/>
-        </w:rPr>
-        <w:t>(value1, value2,</w:t>
+        <w:t>VALUES (value1, value2,</w:t>
       </w:r>
       <w:r>
         <w:rPr>
@@ -1585,14 +1572,7 @@
           <w:rFonts w:hint="eastAsia"/>
           <w:color w:val="FF0000"/>
         </w:rPr>
-        <w:t>UPDATE</w:t>
-      </w:r>
-      <w:r>
-        <w:rPr>
-          <w:rFonts w:hint="eastAsia"/>
-          <w:color w:val="FF0000"/>
-        </w:rPr>
-        <w:t xml:space="preserve">  tbl_name  </w:t>
+        <w:t xml:space="preserve">UPDATE  tbl_name  </w:t>
       </w:r>
     </w:p>
     <w:p>
@@ -1915,15 +1895,7 @@
           <w:kern w:val="0"/>
           <w:szCs w:val="21"/>
         </w:rPr>
-        <w:t>INSERT INTO Student (sno, sname, sbirthday, ssex, sdep</w:t>
-      </w:r>
-      <w:r>
-        <w:rPr>
-          <w:rFonts w:cs="宋体" w:hint="eastAsia"/>
-          <w:kern w:val="0"/>
-          <w:szCs w:val="21"/>
-        </w:rPr>
-        <w:t xml:space="preserve">t, speciality) </w:t>
+        <w:t xml:space="preserve">INSERT INTO Student (sno, sname, sbirthday, ssex, sdept, speciality) </w:t>
       </w:r>
     </w:p>
     <w:p>
@@ -2006,7 +1978,7 @@
           <w:noProof/>
         </w:rPr>
         <w:drawing>
-          <wp:anchor distT="0" distB="0" distL="114300" distR="114300" simplePos="0" relativeHeight="251652608" behindDoc="1" locked="0" layoutInCell="1" allowOverlap="1">
+          <wp:anchor distT="0" distB="0" distL="114300" distR="114300" simplePos="0" relativeHeight="251647488" behindDoc="1" locked="0" layoutInCell="1" allowOverlap="1">
             <wp:simplePos x="0" y="0"/>
             <wp:positionH relativeFrom="column">
               <wp:posOffset>-635</wp:posOffset>
@@ -2198,7 +2170,7 @@
           <w:noProof/>
         </w:rPr>
         <w:drawing>
-          <wp:anchor distT="0" distB="0" distL="114300" distR="114300" simplePos="0" relativeHeight="251656704" behindDoc="1" locked="0" layoutInCell="1" allowOverlap="1">
+          <wp:anchor distT="0" distB="0" distL="114300" distR="114300" simplePos="0" relativeHeight="251651584" behindDoc="1" locked="0" layoutInCell="1" allowOverlap="1">
             <wp:simplePos x="0" y="0"/>
             <wp:positionH relativeFrom="column">
               <wp:posOffset>-3175</wp:posOffset>
@@ -2441,7 +2413,7 @@
           <w:noProof/>
         </w:rPr>
         <w:drawing>
-          <wp:anchor distT="0" distB="0" distL="114300" distR="114300" simplePos="0" relativeHeight="251653632" behindDoc="1" locked="0" layoutInCell="1" allowOverlap="1">
+          <wp:anchor distT="0" distB="0" distL="114300" distR="114300" simplePos="0" relativeHeight="251648512" behindDoc="1" locked="0" layoutInCell="1" allowOverlap="1">
             <wp:simplePos x="0" y="0"/>
             <wp:positionH relativeFrom="column">
               <wp:posOffset>-3175</wp:posOffset>
@@ -2651,7 +2623,7 @@
           <w:noProof/>
         </w:rPr>
         <w:drawing>
-          <wp:anchor distT="0" distB="0" distL="114300" distR="114300" simplePos="0" relativeHeight="251654656" behindDoc="1" locked="0" layoutInCell="1" allowOverlap="1">
+          <wp:anchor distT="0" distB="0" distL="114300" distR="114300" simplePos="0" relativeHeight="251649536" behindDoc="1" locked="0" layoutInCell="1" allowOverlap="1">
             <wp:simplePos x="0" y="0"/>
             <wp:positionH relativeFrom="column">
               <wp:posOffset>0</wp:posOffset>
@@ -2782,15 +2754,7 @@
           <w:kern w:val="0"/>
           <w:szCs w:val="21"/>
         </w:rPr>
-        <w:t xml:space="preserve">delete from student where </w:t>
-      </w:r>
-      <w:r>
-        <w:rPr>
-          <w:rFonts w:cs="宋体" w:hint="eastAsia"/>
-          <w:kern w:val="0"/>
-          <w:szCs w:val="21"/>
-        </w:rPr>
-        <w:t>sno = '20050302';</w:t>
+        <w:t>delete from student where sno = '20050302';</w:t>
       </w:r>
     </w:p>
     <w:p>
@@ -2807,7 +2771,7 @@
           <w:noProof/>
         </w:rPr>
         <w:drawing>
-          <wp:anchor distT="0" distB="0" distL="114300" distR="114300" simplePos="0" relativeHeight="251658752" behindDoc="1" locked="0" layoutInCell="1" allowOverlap="1">
+          <wp:anchor distT="0" distB="0" distL="114300" distR="114300" simplePos="0" relativeHeight="251657728" behindDoc="1" locked="0" layoutInCell="1" allowOverlap="1">
             <wp:simplePos x="0" y="0"/>
             <wp:positionH relativeFrom="column">
               <wp:posOffset>1270</wp:posOffset>
@@ -2956,7 +2920,7 @@
           <w:noProof/>
         </w:rPr>
         <w:drawing>
-          <wp:anchor distT="0" distB="0" distL="114300" distR="114300" simplePos="0" relativeHeight="251655680" behindDoc="1" locked="0" layoutInCell="1" allowOverlap="1">
+          <wp:anchor distT="0" distB="0" distL="114300" distR="114300" simplePos="0" relativeHeight="251650560" behindDoc="1" locked="0" layoutInCell="1" allowOverlap="1">
             <wp:simplePos x="0" y="0"/>
             <wp:positionH relativeFrom="column">
               <wp:posOffset>0</wp:posOffset>
@@ -3104,7 +3068,7 @@
           <w:noProof/>
         </w:rPr>
         <w:drawing>
-          <wp:anchor distT="0" distB="0" distL="114300" distR="114300" simplePos="0" relativeHeight="251657728" behindDoc="1" locked="0" layoutInCell="1" allowOverlap="1">
+          <wp:anchor distT="0" distB="0" distL="114300" distR="114300" simplePos="0" relativeHeight="251655680" behindDoc="1" locked="0" layoutInCell="1" allowOverlap="1">
             <wp:simplePos x="0" y="0"/>
             <wp:positionH relativeFrom="column">
               <wp:posOffset>0</wp:posOffset>
@@ -3215,15 +3179,7 @@
           <w:kern w:val="0"/>
           <w:szCs w:val="21"/>
         </w:rPr>
-        <w:t>delete from sc where sno in (sele</w:t>
-      </w:r>
-      <w:r>
-        <w:rPr>
-          <w:rFonts w:cs="宋体" w:hint="eastAsia"/>
-          <w:kern w:val="0"/>
-          <w:szCs w:val="21"/>
-        </w:rPr>
-        <w:t>ct sno from student where sname = '</w:t>
+        <w:t>delete from sc where sno in (select sno from student where sname = '</w:t>
       </w:r>
       <w:r>
         <w:rPr>
@@ -4590,7 +4546,7 @@
           <w:noProof/>
         </w:rPr>
         <w:drawing>
-          <wp:anchor distT="0" distB="0" distL="114300" distR="114300" simplePos="0" relativeHeight="251660800" behindDoc="1" locked="0" layoutInCell="1" allowOverlap="1">
+          <wp:anchor distT="0" distB="0" distL="114300" distR="114300" simplePos="0" relativeHeight="251665920" behindDoc="1" locked="0" layoutInCell="1" allowOverlap="1">
             <wp:simplePos x="0" y="0"/>
             <wp:positionH relativeFrom="column">
               <wp:posOffset>-1905</wp:posOffset>
@@ -4804,27 +4760,7 @@
       <w:pPr>
         <w:spacing w:line="400" w:lineRule="exact"/>
         <w:rPr>
-          <w:rFonts w:cs="宋体"/>
-          <w:kern w:val="0"/>
-          <w:szCs w:val="21"/>
-        </w:rPr>
-      </w:pPr>
-    </w:p>
-    <w:p>
-      <w:pPr>
-        <w:spacing w:line="400" w:lineRule="exact"/>
-        <w:rPr>
-          <w:rFonts w:cs="宋体"/>
-          <w:kern w:val="0"/>
-          <w:szCs w:val="21"/>
-        </w:rPr>
-      </w:pPr>
-    </w:p>
-    <w:p>
-      <w:pPr>
-        <w:spacing w:line="400" w:lineRule="exact"/>
-        <w:rPr>
-          <w:rFonts w:cs="宋体"/>
+          <w:rFonts w:cs="宋体" w:hint="eastAsia"/>
           <w:kern w:val="0"/>
           <w:szCs w:val="21"/>
         </w:rPr>
@@ -4833,8 +4769,9 @@
         <w:rPr>
           <w:noProof/>
         </w:rPr>
+        <w:lastRenderedPageBreak/>
         <w:drawing>
-          <wp:anchor distT="0" distB="0" distL="114300" distR="114300" simplePos="0" relativeHeight="251661824" behindDoc="1" locked="0" layoutInCell="1" allowOverlap="1">
+          <wp:anchor distT="0" distB="0" distL="114300" distR="114300" simplePos="0" relativeHeight="251663872" behindDoc="1" locked="0" layoutInCell="1" allowOverlap="1" wp14:anchorId="3971DE4F" wp14:editId="606A3DA9">
             <wp:simplePos x="0" y="0"/>
             <wp:positionH relativeFrom="column">
               <wp:posOffset>-15875</wp:posOffset>
@@ -4991,15 +4928,7 @@
           <w:kern w:val="0"/>
           <w:szCs w:val="21"/>
         </w:rPr>
-        <w:t>答：</w:t>
-      </w:r>
-      <w:r>
-        <w:rPr>
-          <w:rFonts w:cs="宋体" w:hint="eastAsia"/>
-          <w:kern w:val="0"/>
-          <w:szCs w:val="21"/>
-        </w:rPr>
-        <w:t>代码：</w:t>
+        <w:t>答：代码：</w:t>
       </w:r>
       <w:r>
         <w:rPr>
@@ -5032,7 +4961,7 @@
       <w:pPr>
         <w:spacing w:line="400" w:lineRule="exact"/>
         <w:rPr>
-          <w:rFonts w:cs="宋体" w:hint="eastAsia"/>
+          <w:rFonts w:cs="宋体"/>
           <w:kern w:val="0"/>
           <w:szCs w:val="21"/>
         </w:rPr>
@@ -5042,7 +4971,7 @@
           <w:noProof/>
         </w:rPr>
         <w:drawing>
-          <wp:anchor distT="0" distB="0" distL="114300" distR="114300" simplePos="0" relativeHeight="251662848" behindDoc="1" locked="0" layoutInCell="1" allowOverlap="1" wp14:anchorId="75AA8240" wp14:editId="2953B967">
+          <wp:anchor distT="0" distB="0" distL="114300" distR="114300" simplePos="0" relativeHeight="251666944" behindDoc="1" locked="0" layoutInCell="1" allowOverlap="1" wp14:anchorId="75AA8240" wp14:editId="2953B967">
             <wp:simplePos x="0" y="0"/>
             <wp:positionH relativeFrom="column">
               <wp:posOffset>6824</wp:posOffset>
@@ -5117,14 +5046,8 @@
           <w:szCs w:val="21"/>
         </w:rPr>
       </w:pPr>
-      <w:r>
-        <w:rPr>
-          <w:rFonts w:cs="宋体" w:hint="eastAsia"/>
-          <w:kern w:val="0"/>
-          <w:szCs w:val="21"/>
-        </w:rPr>
-        <w:t xml:space="preserve"> </w:t>
-      </w:r>
+      <w:bookmarkStart w:id="0" w:name="_GoBack"/>
+      <w:bookmarkEnd w:id="0"/>
       <w:r>
         <w:rPr>
           <w:rFonts w:cs="宋体" w:hint="eastAsia"/>
@@ -5181,15 +5104,7 @@
           <w:kern w:val="0"/>
           <w:szCs w:val="21"/>
         </w:rPr>
-        <w:t>答：</w:t>
-      </w:r>
-      <w:r>
-        <w:rPr>
-          <w:rFonts w:cs="宋体" w:hint="eastAsia"/>
-          <w:kern w:val="0"/>
-          <w:szCs w:val="21"/>
-        </w:rPr>
-        <w:t>代码：</w:t>
+        <w:t>答：代码：</w:t>
       </w:r>
       <w:r>
         <w:rPr>
@@ -5250,20 +5165,21 @@
       <w:pPr>
         <w:spacing w:line="400" w:lineRule="exact"/>
         <w:rPr>
-          <w:rFonts w:cs="宋体" w:hint="eastAsia"/>
-          <w:kern w:val="0"/>
-          <w:szCs w:val="21"/>
-        </w:rPr>
-      </w:pPr>
-      <w:r>
-        <w:rPr>
-          <w:rFonts w:cs="宋体"/>
+          <w:rFonts w:cs="宋体"/>
+          <w:kern w:val="0"/>
+          <w:szCs w:val="21"/>
+        </w:rPr>
+      </w:pPr>
+      <w:r>
+        <w:rPr>
+          <w:rFonts w:cs="宋体"/>
+          <w:noProof/>
           <w:kern w:val="0"/>
           <w:szCs w:val="21"/>
         </w:rPr>
         <w:lastRenderedPageBreak/>
         <w:drawing>
-          <wp:anchor distT="0" distB="0" distL="114300" distR="114300" simplePos="0" relativeHeight="251663872" behindDoc="1" locked="0" layoutInCell="1" allowOverlap="1">
+          <wp:anchor distT="0" distB="0" distL="114300" distR="114300" simplePos="0" relativeHeight="251667968" behindDoc="1" locked="0" layoutInCell="1" allowOverlap="1">
             <wp:simplePos x="0" y="0"/>
             <wp:positionH relativeFrom="column">
               <wp:posOffset>3175</wp:posOffset>
@@ -5320,8 +5236,6 @@
           </wp:anchor>
         </w:drawing>
       </w:r>
-      <w:bookmarkStart w:id="0" w:name="_GoBack"/>
-      <w:bookmarkEnd w:id="0"/>
     </w:p>
     <w:p>
       <w:pPr>
@@ -5498,16 +5412,104 @@
           <w:szCs w:val="21"/>
         </w:rPr>
       </w:pPr>
-    </w:p>
-    <w:p>
-      <w:pPr>
-        <w:spacing w:line="400" w:lineRule="exact"/>
-        <w:rPr>
-          <w:rFonts w:cs="宋体"/>
-          <w:kern w:val="0"/>
-          <w:szCs w:val="21"/>
-        </w:rPr>
-      </w:pPr>
+      <w:r>
+        <w:rPr>
+          <w:rFonts w:cs="宋体" w:hint="eastAsia"/>
+          <w:kern w:val="0"/>
+          <w:szCs w:val="21"/>
+        </w:rPr>
+        <w:t>答：代码：</w:t>
+      </w:r>
+      <w:r>
+        <w:rPr>
+          <w:rFonts w:cs="宋体"/>
+          <w:kern w:val="0"/>
+          <w:szCs w:val="21"/>
+        </w:rPr>
+        <w:t>create view sc_view1 as select * from sc where degree &gt; 90;</w:t>
+      </w:r>
+    </w:p>
+    <w:p>
+      <w:pPr>
+        <w:spacing w:line="400" w:lineRule="exact"/>
+        <w:rPr>
+          <w:rFonts w:cs="宋体" w:hint="eastAsia"/>
+          <w:kern w:val="0"/>
+          <w:szCs w:val="21"/>
+        </w:rPr>
+      </w:pPr>
+      <w:r>
+        <w:rPr>
+          <w:rFonts w:cs="宋体"/>
+          <w:kern w:val="0"/>
+          <w:szCs w:val="21"/>
+        </w:rPr>
+        <w:drawing>
+          <wp:anchor distT="0" distB="0" distL="114300" distR="114300" simplePos="0" relativeHeight="251651584" behindDoc="1" locked="0" layoutInCell="1" allowOverlap="1" wp14:anchorId="680D98B7" wp14:editId="6CA8A3A2">
+            <wp:simplePos x="0" y="0"/>
+            <wp:positionH relativeFrom="column">
+              <wp:posOffset>19050</wp:posOffset>
+            </wp:positionH>
+            <wp:positionV relativeFrom="paragraph">
+              <wp:posOffset>266700</wp:posOffset>
+            </wp:positionV>
+            <wp:extent cx="5274310" cy="1901825"/>
+            <wp:effectExtent l="0" t="0" r="2540" b="3175"/>
+            <wp:wrapTight wrapText="bothSides">
+              <wp:wrapPolygon edited="0">
+                <wp:start x="0" y="0"/>
+                <wp:lineTo x="0" y="21420"/>
+                <wp:lineTo x="21532" y="21420"/>
+                <wp:lineTo x="21532" y="0"/>
+                <wp:lineTo x="0" y="0"/>
+              </wp:wrapPolygon>
+            </wp:wrapTight>
+            <wp:docPr id="3" name="图片 3"/>
+            <wp:cNvGraphicFramePr>
+              <a:graphicFrameLocks xmlns:a="http://schemas.openxmlformats.org/drawingml/2006/main" noChangeAspect="1"/>
+            </wp:cNvGraphicFramePr>
+            <a:graphic xmlns:a="http://schemas.openxmlformats.org/drawingml/2006/main">
+              <a:graphicData uri="http://schemas.openxmlformats.org/drawingml/2006/picture">
+                <pic:pic xmlns:pic="http://schemas.openxmlformats.org/drawingml/2006/picture">
+                  <pic:nvPicPr>
+                    <pic:cNvPr id="1" name=""/>
+                    <pic:cNvPicPr/>
+                  </pic:nvPicPr>
+                  <pic:blipFill>
+                    <a:blip r:embed="rId20">
+                      <a:extLst>
+                        <a:ext uri="{28A0092B-C50C-407E-A947-70E740481C1C}">
+                          <a14:useLocalDpi xmlns:a14="http://schemas.microsoft.com/office/drawing/2010/main" val="0"/>
+                        </a:ext>
+                      </a:extLst>
+                    </a:blip>
+                    <a:stretch>
+                      <a:fillRect/>
+                    </a:stretch>
+                  </pic:blipFill>
+                  <pic:spPr>
+                    <a:xfrm>
+                      <a:off x="0" y="0"/>
+                      <a:ext cx="5274310" cy="1901825"/>
+                    </a:xfrm>
+                    <a:prstGeom prst="rect">
+                      <a:avLst/>
+                    </a:prstGeom>
+                  </pic:spPr>
+                </pic:pic>
+              </a:graphicData>
+            </a:graphic>
+          </wp:anchor>
+        </w:drawing>
+      </w:r>
+      <w:r>
+        <w:rPr>
+          <w:rFonts w:cs="宋体" w:hint="eastAsia"/>
+          <w:kern w:val="0"/>
+          <w:szCs w:val="21"/>
+        </w:rPr>
+        <w:t>截图：</w:t>
+      </w:r>
     </w:p>
     <w:p>
       <w:pPr>
@@ -5626,32 +5628,169 @@
           <w:szCs w:val="21"/>
         </w:rPr>
       </w:pPr>
-    </w:p>
-    <w:p>
-      <w:pPr>
-        <w:spacing w:line="400" w:lineRule="exact"/>
-        <w:rPr>
-          <w:rFonts w:cs="宋体"/>
-          <w:kern w:val="0"/>
-          <w:szCs w:val="21"/>
-        </w:rPr>
-      </w:pPr>
-    </w:p>
-    <w:p>
-      <w:pPr>
-        <w:spacing w:line="400" w:lineRule="exact"/>
-        <w:rPr>
-          <w:rFonts w:cs="宋体"/>
-          <w:kern w:val="0"/>
-          <w:szCs w:val="21"/>
-        </w:rPr>
-      </w:pPr>
-      <w:r>
-        <w:rPr>
-          <w:rFonts w:cs="宋体" w:hint="eastAsia"/>
-          <w:kern w:val="0"/>
-          <w:szCs w:val="21"/>
-        </w:rPr>
+      <w:r>
+        <w:rPr>
+          <w:rFonts w:cs="宋体" w:hint="eastAsia"/>
+          <w:kern w:val="0"/>
+          <w:szCs w:val="21"/>
+        </w:rPr>
+        <w:t>答：代码：</w:t>
+      </w:r>
+      <w:r>
+        <w:rPr>
+          <w:rFonts w:cs="宋体" w:hint="eastAsia"/>
+          <w:kern w:val="0"/>
+          <w:szCs w:val="21"/>
+        </w:rPr>
+        <w:t>create view sc_view2 as select sno as '</w:t>
+      </w:r>
+      <w:r>
+        <w:rPr>
+          <w:rFonts w:cs="宋体" w:hint="eastAsia"/>
+          <w:kern w:val="0"/>
+          <w:szCs w:val="21"/>
+        </w:rPr>
+        <w:t>学号</w:t>
+      </w:r>
+      <w:r>
+        <w:rPr>
+          <w:rFonts w:cs="宋体" w:hint="eastAsia"/>
+          <w:kern w:val="0"/>
+          <w:szCs w:val="21"/>
+        </w:rPr>
+        <w:t>', cno as '</w:t>
+      </w:r>
+      <w:r>
+        <w:rPr>
+          <w:rFonts w:cs="宋体" w:hint="eastAsia"/>
+          <w:kern w:val="0"/>
+          <w:szCs w:val="21"/>
+        </w:rPr>
+        <w:t>课程号</w:t>
+      </w:r>
+      <w:r>
+        <w:rPr>
+          <w:rFonts w:cs="宋体" w:hint="eastAsia"/>
+          <w:kern w:val="0"/>
+          <w:szCs w:val="21"/>
+        </w:rPr>
+        <w:t>', degree as '</w:t>
+      </w:r>
+      <w:r>
+        <w:rPr>
+          <w:rFonts w:cs="宋体" w:hint="eastAsia"/>
+          <w:kern w:val="0"/>
+          <w:szCs w:val="21"/>
+        </w:rPr>
+        <w:t>成绩</w:t>
+      </w:r>
+      <w:r>
+        <w:rPr>
+          <w:rFonts w:cs="宋体" w:hint="eastAsia"/>
+          <w:kern w:val="0"/>
+          <w:szCs w:val="21"/>
+        </w:rPr>
+        <w:t>' from sc where degree &lt; 80;</w:t>
+      </w:r>
+    </w:p>
+    <w:p>
+      <w:pPr>
+        <w:spacing w:line="400" w:lineRule="exact"/>
+        <w:rPr>
+          <w:rFonts w:cs="宋体" w:hint="eastAsia"/>
+          <w:kern w:val="0"/>
+          <w:szCs w:val="21"/>
+        </w:rPr>
+      </w:pPr>
+      <w:r>
+        <w:rPr>
+          <w:rFonts w:cs="宋体"/>
+          <w:kern w:val="0"/>
+          <w:szCs w:val="21"/>
+        </w:rPr>
+        <w:drawing>
+          <wp:anchor distT="0" distB="0" distL="114300" distR="114300" simplePos="0" relativeHeight="251652608" behindDoc="1" locked="0" layoutInCell="1" allowOverlap="1" wp14:anchorId="189A9E58" wp14:editId="7EB95475">
+            <wp:simplePos x="0" y="0"/>
+            <wp:positionH relativeFrom="column">
+              <wp:posOffset>0</wp:posOffset>
+            </wp:positionH>
+            <wp:positionV relativeFrom="paragraph">
+              <wp:posOffset>374650</wp:posOffset>
+            </wp:positionV>
+            <wp:extent cx="5274310" cy="1899285"/>
+            <wp:effectExtent l="0" t="0" r="2540" b="5715"/>
+            <wp:wrapTight wrapText="bothSides">
+              <wp:wrapPolygon edited="0">
+                <wp:start x="0" y="0"/>
+                <wp:lineTo x="0" y="21448"/>
+                <wp:lineTo x="21532" y="21448"/>
+                <wp:lineTo x="21532" y="0"/>
+                <wp:lineTo x="0" y="0"/>
+              </wp:wrapPolygon>
+            </wp:wrapTight>
+            <wp:docPr id="14" name="图片 14"/>
+            <wp:cNvGraphicFramePr>
+              <a:graphicFrameLocks xmlns:a="http://schemas.openxmlformats.org/drawingml/2006/main" noChangeAspect="1"/>
+            </wp:cNvGraphicFramePr>
+            <a:graphic xmlns:a="http://schemas.openxmlformats.org/drawingml/2006/main">
+              <a:graphicData uri="http://schemas.openxmlformats.org/drawingml/2006/picture">
+                <pic:pic xmlns:pic="http://schemas.openxmlformats.org/drawingml/2006/picture">
+                  <pic:nvPicPr>
+                    <pic:cNvPr id="1" name=""/>
+                    <pic:cNvPicPr/>
+                  </pic:nvPicPr>
+                  <pic:blipFill>
+                    <a:blip r:embed="rId21">
+                      <a:extLst>
+                        <a:ext uri="{28A0092B-C50C-407E-A947-70E740481C1C}">
+                          <a14:useLocalDpi xmlns:a14="http://schemas.microsoft.com/office/drawing/2010/main" val="0"/>
+                        </a:ext>
+                      </a:extLst>
+                    </a:blip>
+                    <a:stretch>
+                      <a:fillRect/>
+                    </a:stretch>
+                  </pic:blipFill>
+                  <pic:spPr>
+                    <a:xfrm>
+                      <a:off x="0" y="0"/>
+                      <a:ext cx="5274310" cy="1899285"/>
+                    </a:xfrm>
+                    <a:prstGeom prst="rect">
+                      <a:avLst/>
+                    </a:prstGeom>
+                  </pic:spPr>
+                </pic:pic>
+              </a:graphicData>
+            </a:graphic>
+          </wp:anchor>
+        </w:drawing>
+      </w:r>
+      <w:r>
+        <w:rPr>
+          <w:rFonts w:cs="宋体" w:hint="eastAsia"/>
+          <w:kern w:val="0"/>
+          <w:szCs w:val="21"/>
+        </w:rPr>
+        <w:t>截图：</w:t>
+      </w:r>
+    </w:p>
+    <w:p>
+      <w:pPr>
+        <w:spacing w:line="400" w:lineRule="exact"/>
+        <w:rPr>
+          <w:rFonts w:cs="宋体"/>
+          <w:kern w:val="0"/>
+          <w:szCs w:val="21"/>
+        </w:rPr>
+      </w:pPr>
+      <w:r>
+        <w:rPr>
+          <w:rFonts w:cs="宋体" w:hint="eastAsia"/>
+          <w:kern w:val="0"/>
+          <w:szCs w:val="21"/>
+        </w:rPr>
+        <w:lastRenderedPageBreak/>
         <w:t>③</w:t>
       </w:r>
       <w:r>
@@ -5818,16 +5957,104 @@
           <w:szCs w:val="21"/>
         </w:rPr>
       </w:pPr>
-    </w:p>
-    <w:p>
-      <w:pPr>
-        <w:spacing w:line="400" w:lineRule="exact"/>
-        <w:rPr>
-          <w:rFonts w:cs="宋体"/>
-          <w:kern w:val="0"/>
-          <w:szCs w:val="21"/>
-        </w:rPr>
-      </w:pPr>
+      <w:r>
+        <w:rPr>
+          <w:rFonts w:cs="宋体" w:hint="eastAsia"/>
+          <w:kern w:val="0"/>
+          <w:szCs w:val="21"/>
+        </w:rPr>
+        <w:t>答：代码：</w:t>
+      </w:r>
+      <w:r>
+        <w:rPr>
+          <w:rFonts w:cs="宋体"/>
+          <w:kern w:val="0"/>
+          <w:szCs w:val="21"/>
+        </w:rPr>
+        <w:t>create view sc_view3 as select s.sname, c.cname, sc.degree from student s join sc on s.sno = sc.sno join course c on sc.cno = c.cno where s.speciality = '20070303';</w:t>
+      </w:r>
+    </w:p>
+    <w:p>
+      <w:pPr>
+        <w:spacing w:line="400" w:lineRule="exact"/>
+        <w:rPr>
+          <w:rFonts w:cs="宋体" w:hint="eastAsia"/>
+          <w:kern w:val="0"/>
+          <w:szCs w:val="21"/>
+        </w:rPr>
+      </w:pPr>
+      <w:r>
+        <w:rPr>
+          <w:rFonts w:cs="宋体"/>
+          <w:kern w:val="0"/>
+          <w:szCs w:val="21"/>
+        </w:rPr>
+        <w:drawing>
+          <wp:anchor distT="0" distB="0" distL="114300" distR="114300" simplePos="0" relativeHeight="251654656" behindDoc="1" locked="0" layoutInCell="1" allowOverlap="1" wp14:anchorId="12BF5D49" wp14:editId="526A84F9">
+            <wp:simplePos x="0" y="0"/>
+            <wp:positionH relativeFrom="column">
+              <wp:posOffset>-1270</wp:posOffset>
+            </wp:positionH>
+            <wp:positionV relativeFrom="paragraph">
+              <wp:posOffset>293649</wp:posOffset>
+            </wp:positionV>
+            <wp:extent cx="5274310" cy="1603375"/>
+            <wp:effectExtent l="0" t="0" r="2540" b="0"/>
+            <wp:wrapTight wrapText="bothSides">
+              <wp:wrapPolygon edited="0">
+                <wp:start x="0" y="0"/>
+                <wp:lineTo x="0" y="21301"/>
+                <wp:lineTo x="21532" y="21301"/>
+                <wp:lineTo x="21532" y="0"/>
+                <wp:lineTo x="0" y="0"/>
+              </wp:wrapPolygon>
+            </wp:wrapTight>
+            <wp:docPr id="16" name="图片 16"/>
+            <wp:cNvGraphicFramePr>
+              <a:graphicFrameLocks xmlns:a="http://schemas.openxmlformats.org/drawingml/2006/main" noChangeAspect="1"/>
+            </wp:cNvGraphicFramePr>
+            <a:graphic xmlns:a="http://schemas.openxmlformats.org/drawingml/2006/main">
+              <a:graphicData uri="http://schemas.openxmlformats.org/drawingml/2006/picture">
+                <pic:pic xmlns:pic="http://schemas.openxmlformats.org/drawingml/2006/picture">
+                  <pic:nvPicPr>
+                    <pic:cNvPr id="1" name=""/>
+                    <pic:cNvPicPr/>
+                  </pic:nvPicPr>
+                  <pic:blipFill>
+                    <a:blip r:embed="rId22" cstate="print">
+                      <a:extLst>
+                        <a:ext uri="{28A0092B-C50C-407E-A947-70E740481C1C}">
+                          <a14:useLocalDpi xmlns:a14="http://schemas.microsoft.com/office/drawing/2010/main" val="0"/>
+                        </a:ext>
+                      </a:extLst>
+                    </a:blip>
+                    <a:stretch>
+                      <a:fillRect/>
+                    </a:stretch>
+                  </pic:blipFill>
+                  <pic:spPr>
+                    <a:xfrm>
+                      <a:off x="0" y="0"/>
+                      <a:ext cx="5274310" cy="1603375"/>
+                    </a:xfrm>
+                    <a:prstGeom prst="rect">
+                      <a:avLst/>
+                    </a:prstGeom>
+                  </pic:spPr>
+                </pic:pic>
+              </a:graphicData>
+            </a:graphic>
+          </wp:anchor>
+        </w:drawing>
+      </w:r>
+      <w:r>
+        <w:rPr>
+          <w:rFonts w:cs="宋体" w:hint="eastAsia"/>
+          <w:kern w:val="0"/>
+          <w:szCs w:val="21"/>
+        </w:rPr>
+        <w:t>截图：</w:t>
+      </w:r>
     </w:p>
     <w:p>
       <w:pPr>
@@ -5920,16 +6147,104 @@
           <w:szCs w:val="21"/>
         </w:rPr>
       </w:pPr>
-    </w:p>
-    <w:p>
-      <w:pPr>
-        <w:spacing w:line="400" w:lineRule="exact"/>
-        <w:rPr>
-          <w:rFonts w:cs="宋体"/>
-          <w:kern w:val="0"/>
-          <w:szCs w:val="21"/>
-        </w:rPr>
-      </w:pPr>
+      <w:r>
+        <w:rPr>
+          <w:rFonts w:cs="宋体" w:hint="eastAsia"/>
+          <w:kern w:val="0"/>
+          <w:szCs w:val="21"/>
+        </w:rPr>
+        <w:t>答：代码：</w:t>
+      </w:r>
+      <w:r>
+        <w:rPr>
+          <w:rFonts w:cs="宋体"/>
+          <w:kern w:val="0"/>
+          <w:szCs w:val="21"/>
+        </w:rPr>
+        <w:t>create view sc_view4 as select * from sc_view1 where cno = 'C01';</w:t>
+      </w:r>
+    </w:p>
+    <w:p>
+      <w:pPr>
+        <w:spacing w:line="400" w:lineRule="exact"/>
+        <w:rPr>
+          <w:rFonts w:cs="宋体" w:hint="eastAsia"/>
+          <w:kern w:val="0"/>
+          <w:szCs w:val="21"/>
+        </w:rPr>
+      </w:pPr>
+      <w:r>
+        <w:rPr>
+          <w:rFonts w:cs="宋体"/>
+          <w:kern w:val="0"/>
+          <w:szCs w:val="21"/>
+        </w:rPr>
+        <w:drawing>
+          <wp:anchor distT="0" distB="0" distL="114300" distR="114300" simplePos="0" relativeHeight="251655680" behindDoc="1" locked="0" layoutInCell="1" allowOverlap="1" wp14:anchorId="4C47277E" wp14:editId="60C2EB42">
+            <wp:simplePos x="0" y="0"/>
+            <wp:positionH relativeFrom="column">
+              <wp:posOffset>-1270</wp:posOffset>
+            </wp:positionH>
+            <wp:positionV relativeFrom="paragraph">
+              <wp:posOffset>277597</wp:posOffset>
+            </wp:positionV>
+            <wp:extent cx="5274310" cy="2251075"/>
+            <wp:effectExtent l="0" t="0" r="2540" b="0"/>
+            <wp:wrapTight wrapText="bothSides">
+              <wp:wrapPolygon edited="0">
+                <wp:start x="0" y="0"/>
+                <wp:lineTo x="0" y="21387"/>
+                <wp:lineTo x="21532" y="21387"/>
+                <wp:lineTo x="21532" y="0"/>
+                <wp:lineTo x="0" y="0"/>
+              </wp:wrapPolygon>
+            </wp:wrapTight>
+            <wp:docPr id="17" name="图片 17"/>
+            <wp:cNvGraphicFramePr>
+              <a:graphicFrameLocks xmlns:a="http://schemas.openxmlformats.org/drawingml/2006/main" noChangeAspect="1"/>
+            </wp:cNvGraphicFramePr>
+            <a:graphic xmlns:a="http://schemas.openxmlformats.org/drawingml/2006/main">
+              <a:graphicData uri="http://schemas.openxmlformats.org/drawingml/2006/picture">
+                <pic:pic xmlns:pic="http://schemas.openxmlformats.org/drawingml/2006/picture">
+                  <pic:nvPicPr>
+                    <pic:cNvPr id="1" name=""/>
+                    <pic:cNvPicPr/>
+                  </pic:nvPicPr>
+                  <pic:blipFill>
+                    <a:blip r:embed="rId23">
+                      <a:extLst>
+                        <a:ext uri="{28A0092B-C50C-407E-A947-70E740481C1C}">
+                          <a14:useLocalDpi xmlns:a14="http://schemas.microsoft.com/office/drawing/2010/main" val="0"/>
+                        </a:ext>
+                      </a:extLst>
+                    </a:blip>
+                    <a:stretch>
+                      <a:fillRect/>
+                    </a:stretch>
+                  </pic:blipFill>
+                  <pic:spPr>
+                    <a:xfrm>
+                      <a:off x="0" y="0"/>
+                      <a:ext cx="5274310" cy="2251075"/>
+                    </a:xfrm>
+                    <a:prstGeom prst="rect">
+                      <a:avLst/>
+                    </a:prstGeom>
+                  </pic:spPr>
+                </pic:pic>
+              </a:graphicData>
+            </a:graphic>
+          </wp:anchor>
+        </w:drawing>
+      </w:r>
+      <w:r>
+        <w:rPr>
+          <w:rFonts w:cs="宋体" w:hint="eastAsia"/>
+          <w:kern w:val="0"/>
+          <w:szCs w:val="21"/>
+        </w:rPr>
+        <w:t>截图：</w:t>
+      </w:r>
     </w:p>
     <w:p>
       <w:pPr>
@@ -6074,16 +6389,115 @@
           <w:szCs w:val="21"/>
         </w:rPr>
       </w:pPr>
-    </w:p>
-    <w:p>
-      <w:pPr>
-        <w:spacing w:line="400" w:lineRule="exact"/>
-        <w:rPr>
-          <w:rFonts w:cs="宋体"/>
-          <w:kern w:val="0"/>
-          <w:szCs w:val="21"/>
-        </w:rPr>
-      </w:pPr>
+      <w:r>
+        <w:rPr>
+          <w:rFonts w:cs="宋体" w:hint="eastAsia"/>
+          <w:kern w:val="0"/>
+          <w:szCs w:val="21"/>
+        </w:rPr>
+        <w:t>答：代码：</w:t>
+      </w:r>
+      <w:r>
+        <w:rPr>
+          <w:rFonts w:cs="宋体"/>
+          <w:kern w:val="0"/>
+          <w:szCs w:val="21"/>
+        </w:rPr>
+        <w:t>alter view sc_view1 as select sc.* from sc join teaching t on sc.cno = t.cno where sc.degree &gt; 90 and t.cterm = 3;</w:t>
+      </w:r>
+    </w:p>
+    <w:p>
+      <w:pPr>
+        <w:spacing w:line="400" w:lineRule="exact"/>
+        <w:rPr>
+          <w:rFonts w:cs="宋体" w:hint="eastAsia"/>
+          <w:kern w:val="0"/>
+          <w:szCs w:val="21"/>
+        </w:rPr>
+      </w:pPr>
+      <w:r>
+        <w:rPr>
+          <w:rFonts w:cs="宋体" w:hint="eastAsia"/>
+          <w:kern w:val="0"/>
+          <w:szCs w:val="21"/>
+        </w:rPr>
+        <w:t>截图：</w:t>
+      </w:r>
+    </w:p>
+    <w:p>
+      <w:pPr>
+        <w:spacing w:line="400" w:lineRule="exact"/>
+        <w:rPr>
+          <w:rFonts w:cs="宋体" w:hint="eastAsia"/>
+          <w:kern w:val="0"/>
+          <w:szCs w:val="21"/>
+        </w:rPr>
+      </w:pPr>
+      <w:r>
+        <w:rPr>
+          <w:rFonts w:cs="宋体"/>
+          <w:kern w:val="0"/>
+          <w:szCs w:val="21"/>
+        </w:rPr>
+        <w:lastRenderedPageBreak/>
+        <w:drawing>
+          <wp:anchor distT="0" distB="0" distL="114300" distR="114300" simplePos="0" relativeHeight="251657728" behindDoc="1" locked="0" layoutInCell="1" allowOverlap="1" wp14:anchorId="5992295E" wp14:editId="5749DA75">
+            <wp:simplePos x="0" y="0"/>
+            <wp:positionH relativeFrom="column">
+              <wp:posOffset>-4417</wp:posOffset>
+            </wp:positionH>
+            <wp:positionV relativeFrom="paragraph">
+              <wp:posOffset>5080</wp:posOffset>
+            </wp:positionV>
+            <wp:extent cx="5274310" cy="1771650"/>
+            <wp:effectExtent l="0" t="0" r="2540" b="0"/>
+            <wp:wrapTight wrapText="bothSides">
+              <wp:wrapPolygon edited="0">
+                <wp:start x="0" y="0"/>
+                <wp:lineTo x="0" y="21368"/>
+                <wp:lineTo x="21532" y="21368"/>
+                <wp:lineTo x="21532" y="0"/>
+                <wp:lineTo x="0" y="0"/>
+              </wp:wrapPolygon>
+            </wp:wrapTight>
+            <wp:docPr id="18" name="图片 18"/>
+            <wp:cNvGraphicFramePr>
+              <a:graphicFrameLocks xmlns:a="http://schemas.openxmlformats.org/drawingml/2006/main" noChangeAspect="1"/>
+            </wp:cNvGraphicFramePr>
+            <a:graphic xmlns:a="http://schemas.openxmlformats.org/drawingml/2006/main">
+              <a:graphicData uri="http://schemas.openxmlformats.org/drawingml/2006/picture">
+                <pic:pic xmlns:pic="http://schemas.openxmlformats.org/drawingml/2006/picture">
+                  <pic:nvPicPr>
+                    <pic:cNvPr id="1" name=""/>
+                    <pic:cNvPicPr/>
+                  </pic:nvPicPr>
+                  <pic:blipFill>
+                    <a:blip r:embed="rId24">
+                      <a:extLst>
+                        <a:ext uri="{28A0092B-C50C-407E-A947-70E740481C1C}">
+                          <a14:useLocalDpi xmlns:a14="http://schemas.microsoft.com/office/drawing/2010/main" val="0"/>
+                        </a:ext>
+                      </a:extLst>
+                    </a:blip>
+                    <a:stretch>
+                      <a:fillRect/>
+                    </a:stretch>
+                  </pic:blipFill>
+                  <pic:spPr>
+                    <a:xfrm>
+                      <a:off x="0" y="0"/>
+                      <a:ext cx="5274310" cy="1771650"/>
+                    </a:xfrm>
+                    <a:prstGeom prst="rect">
+                      <a:avLst/>
+                    </a:prstGeom>
+                  </pic:spPr>
+                </pic:pic>
+              </a:graphicData>
+            </a:graphic>
+          </wp:anchor>
+        </w:drawing>
+      </w:r>
     </w:p>
     <w:p>
       <w:pPr>
@@ -6171,16 +6585,1230 @@
       <w:pPr>
         <w:spacing w:line="400" w:lineRule="exact"/>
         <w:rPr>
-          <w:color w:val="000000"/>
-        </w:rPr>
-      </w:pPr>
-      <w:r>
-        <w:rPr>
-          <w:rFonts w:hint="eastAsia"/>
-          <w:color w:val="000000"/>
+          <w:rFonts w:cs="宋体"/>
+          <w:kern w:val="0"/>
+          <w:szCs w:val="21"/>
+        </w:rPr>
+      </w:pPr>
+      <w:r>
+        <w:rPr>
+          <w:rFonts w:cs="宋体" w:hint="eastAsia"/>
+          <w:kern w:val="0"/>
+          <w:szCs w:val="21"/>
+        </w:rPr>
+        <w:t>答：代码：</w:t>
+      </w:r>
+      <w:r>
+        <w:rPr>
+          <w:rFonts w:cs="宋体"/>
+          <w:kern w:val="0"/>
+          <w:szCs w:val="21"/>
+        </w:rPr>
+        <w:t>drop view sc_view1;</w:t>
+      </w:r>
+    </w:p>
+    <w:p>
+      <w:pPr>
+        <w:spacing w:line="400" w:lineRule="exact"/>
+        <w:rPr>
+          <w:rFonts w:cs="宋体" w:hint="eastAsia"/>
+          <w:kern w:val="0"/>
+          <w:szCs w:val="21"/>
+        </w:rPr>
+      </w:pPr>
+      <w:r>
+        <w:rPr>
+          <w:color w:val="000000"/>
+        </w:rPr>
+        <w:drawing>
+          <wp:anchor distT="0" distB="0" distL="114300" distR="114300" simplePos="0" relativeHeight="251658752" behindDoc="1" locked="0" layoutInCell="1" allowOverlap="1" wp14:anchorId="0745ACF9" wp14:editId="1709742C">
+            <wp:simplePos x="0" y="0"/>
+            <wp:positionH relativeFrom="column">
+              <wp:posOffset>-5715</wp:posOffset>
+            </wp:positionH>
+            <wp:positionV relativeFrom="paragraph">
+              <wp:posOffset>283210</wp:posOffset>
+            </wp:positionV>
+            <wp:extent cx="5274310" cy="1854200"/>
+            <wp:effectExtent l="0" t="0" r="2540" b="0"/>
+            <wp:wrapTight wrapText="bothSides">
+              <wp:wrapPolygon edited="0">
+                <wp:start x="0" y="0"/>
+                <wp:lineTo x="0" y="21304"/>
+                <wp:lineTo x="21532" y="21304"/>
+                <wp:lineTo x="21532" y="0"/>
+                <wp:lineTo x="0" y="0"/>
+              </wp:wrapPolygon>
+            </wp:wrapTight>
+            <wp:docPr id="19" name="图片 19"/>
+            <wp:cNvGraphicFramePr>
+              <a:graphicFrameLocks xmlns:a="http://schemas.openxmlformats.org/drawingml/2006/main" noChangeAspect="1"/>
+            </wp:cNvGraphicFramePr>
+            <a:graphic xmlns:a="http://schemas.openxmlformats.org/drawingml/2006/main">
+              <a:graphicData uri="http://schemas.openxmlformats.org/drawingml/2006/picture">
+                <pic:pic xmlns:pic="http://schemas.openxmlformats.org/drawingml/2006/picture">
+                  <pic:nvPicPr>
+                    <pic:cNvPr id="1" name=""/>
+                    <pic:cNvPicPr/>
+                  </pic:nvPicPr>
+                  <pic:blipFill>
+                    <a:blip r:embed="rId25">
+                      <a:extLst>
+                        <a:ext uri="{28A0092B-C50C-407E-A947-70E740481C1C}">
+                          <a14:useLocalDpi xmlns:a14="http://schemas.microsoft.com/office/drawing/2010/main" val="0"/>
+                        </a:ext>
+                      </a:extLst>
+                    </a:blip>
+                    <a:stretch>
+                      <a:fillRect/>
+                    </a:stretch>
+                  </pic:blipFill>
+                  <pic:spPr>
+                    <a:xfrm>
+                      <a:off x="0" y="0"/>
+                      <a:ext cx="5274310" cy="1854200"/>
+                    </a:xfrm>
+                    <a:prstGeom prst="rect">
+                      <a:avLst/>
+                    </a:prstGeom>
+                  </pic:spPr>
+                </pic:pic>
+              </a:graphicData>
+            </a:graphic>
+          </wp:anchor>
+        </w:drawing>
+      </w:r>
+      <w:r>
+        <w:rPr>
+          <w:rFonts w:cs="宋体" w:hint="eastAsia"/>
+          <w:kern w:val="0"/>
+          <w:szCs w:val="21"/>
+        </w:rPr>
+        <w:t>截图：</w:t>
+      </w:r>
+    </w:p>
+    <w:p>
+      <w:pPr>
+        <w:spacing w:line="400" w:lineRule="exact"/>
+        <w:rPr>
+          <w:rFonts w:cs="宋体"/>
+          <w:kern w:val="0"/>
+          <w:szCs w:val="21"/>
+        </w:rPr>
+      </w:pPr>
+      <w:r>
+        <w:rPr>
+          <w:rFonts w:cs="宋体" w:hint="eastAsia"/>
+          <w:kern w:val="0"/>
+          <w:szCs w:val="21"/>
+        </w:rPr>
+        <w:t xml:space="preserve">(4) </w:t>
+      </w:r>
+      <w:r>
+        <w:rPr>
+          <w:rFonts w:cs="宋体" w:hint="eastAsia"/>
+          <w:kern w:val="0"/>
+          <w:szCs w:val="21"/>
+        </w:rPr>
+        <w:t>管理视图中的数据。</w:t>
+      </w:r>
+    </w:p>
+    <w:p>
+      <w:pPr>
+        <w:spacing w:line="400" w:lineRule="exact"/>
+        <w:rPr>
+          <w:rFonts w:cs="宋体"/>
+          <w:kern w:val="0"/>
+          <w:szCs w:val="21"/>
+        </w:rPr>
+      </w:pPr>
+      <w:r>
+        <w:rPr>
+          <w:rFonts w:cs="宋体" w:hint="eastAsia"/>
+          <w:kern w:val="0"/>
+          <w:szCs w:val="21"/>
+        </w:rPr>
+        <w:t>①</w:t>
+      </w:r>
+      <w:r>
+        <w:rPr>
+          <w:rFonts w:cs="宋体" w:hint="eastAsia"/>
+          <w:kern w:val="0"/>
+          <w:szCs w:val="21"/>
         </w:rPr>
         <w:t xml:space="preserve"> </w:t>
       </w:r>
+      <w:r>
+        <w:rPr>
+          <w:rFonts w:cs="宋体" w:hint="eastAsia"/>
+          <w:kern w:val="0"/>
+          <w:szCs w:val="21"/>
+        </w:rPr>
+        <w:t>从视图</w:t>
+      </w:r>
+      <w:r>
+        <w:rPr>
+          <w:rFonts w:cs="宋体"/>
+          <w:kern w:val="0"/>
+          <w:szCs w:val="21"/>
+        </w:rPr>
+        <w:t>sc</w:t>
+      </w:r>
+      <w:r>
+        <w:rPr>
+          <w:rFonts w:cs="宋体" w:hint="eastAsia"/>
+          <w:kern w:val="0"/>
+          <w:szCs w:val="21"/>
+        </w:rPr>
+        <w:t>_view2</w:t>
+      </w:r>
+      <w:r>
+        <w:rPr>
+          <w:rFonts w:cs="宋体" w:hint="eastAsia"/>
+          <w:kern w:val="0"/>
+          <w:szCs w:val="21"/>
+        </w:rPr>
+        <w:t>中查询出学号为“</w:t>
+      </w:r>
+      <w:r>
+        <w:rPr>
+          <w:rFonts w:cs="宋体" w:hint="eastAsia"/>
+          <w:kern w:val="0"/>
+          <w:szCs w:val="21"/>
+        </w:rPr>
+        <w:t>2007030125</w:t>
+      </w:r>
+      <w:r>
+        <w:rPr>
+          <w:rFonts w:cs="宋体" w:hint="eastAsia"/>
+          <w:kern w:val="0"/>
+          <w:szCs w:val="21"/>
+        </w:rPr>
+        <w:t>”、课程号为“</w:t>
+      </w:r>
+      <w:r>
+        <w:rPr>
+          <w:rFonts w:cs="宋体" w:hint="eastAsia"/>
+          <w:kern w:val="0"/>
+          <w:szCs w:val="21"/>
+        </w:rPr>
+        <w:t>a01</w:t>
+      </w:r>
+      <w:r>
+        <w:rPr>
+          <w:rFonts w:cs="宋体" w:hint="eastAsia"/>
+          <w:kern w:val="0"/>
+          <w:szCs w:val="21"/>
+        </w:rPr>
+        <w:t>”的学生选修成绩的信息。</w:t>
+      </w:r>
+    </w:p>
+    <w:p>
+      <w:pPr>
+        <w:spacing w:line="400" w:lineRule="exact"/>
+        <w:rPr>
+          <w:rFonts w:cs="宋体"/>
+          <w:kern w:val="0"/>
+          <w:szCs w:val="21"/>
+        </w:rPr>
+      </w:pPr>
+      <w:r>
+        <w:rPr>
+          <w:rFonts w:cs="宋体" w:hint="eastAsia"/>
+          <w:kern w:val="0"/>
+          <w:szCs w:val="21"/>
+        </w:rPr>
+        <w:t>答：代码：</w:t>
+      </w:r>
+      <w:r>
+        <w:rPr>
+          <w:rFonts w:cs="宋体" w:hint="eastAsia"/>
+          <w:kern w:val="0"/>
+          <w:szCs w:val="21"/>
+        </w:rPr>
+        <w:t>select * from sc_view2 where '</w:t>
+      </w:r>
+      <w:r>
+        <w:rPr>
+          <w:rFonts w:cs="宋体" w:hint="eastAsia"/>
+          <w:kern w:val="0"/>
+          <w:szCs w:val="21"/>
+        </w:rPr>
+        <w:t>学号</w:t>
+      </w:r>
+      <w:r>
+        <w:rPr>
+          <w:rFonts w:cs="宋体" w:hint="eastAsia"/>
+          <w:kern w:val="0"/>
+          <w:szCs w:val="21"/>
+        </w:rPr>
+        <w:t>' = '2007030125' and '</w:t>
+      </w:r>
+      <w:r>
+        <w:rPr>
+          <w:rFonts w:cs="宋体" w:hint="eastAsia"/>
+          <w:kern w:val="0"/>
+          <w:szCs w:val="21"/>
+        </w:rPr>
+        <w:t>课程号</w:t>
+      </w:r>
+      <w:r>
+        <w:rPr>
+          <w:rFonts w:cs="宋体" w:hint="eastAsia"/>
+          <w:kern w:val="0"/>
+          <w:szCs w:val="21"/>
+        </w:rPr>
+        <w:t>' = 'A01';</w:t>
+      </w:r>
+    </w:p>
+    <w:p>
+      <w:pPr>
+        <w:spacing w:line="400" w:lineRule="exact"/>
+        <w:rPr>
+          <w:rFonts w:cs="宋体" w:hint="eastAsia"/>
+          <w:kern w:val="0"/>
+          <w:szCs w:val="21"/>
+        </w:rPr>
+      </w:pPr>
+      <w:r>
+        <w:rPr>
+          <w:rFonts w:cs="宋体"/>
+          <w:kern w:val="0"/>
+          <w:szCs w:val="21"/>
+        </w:rPr>
+        <w:drawing>
+          <wp:anchor distT="0" distB="0" distL="114300" distR="114300" simplePos="0" relativeHeight="251659776" behindDoc="1" locked="0" layoutInCell="1" allowOverlap="1" wp14:anchorId="38654954" wp14:editId="20BAFC2D">
+            <wp:simplePos x="0" y="0"/>
+            <wp:positionH relativeFrom="column">
+              <wp:posOffset>1905</wp:posOffset>
+            </wp:positionH>
+            <wp:positionV relativeFrom="paragraph">
+              <wp:posOffset>304994</wp:posOffset>
+            </wp:positionV>
+            <wp:extent cx="5274310" cy="2094230"/>
+            <wp:effectExtent l="0" t="0" r="2540" b="1270"/>
+            <wp:wrapTight wrapText="bothSides">
+              <wp:wrapPolygon edited="0">
+                <wp:start x="0" y="0"/>
+                <wp:lineTo x="0" y="21417"/>
+                <wp:lineTo x="21532" y="21417"/>
+                <wp:lineTo x="21532" y="0"/>
+                <wp:lineTo x="0" y="0"/>
+              </wp:wrapPolygon>
+            </wp:wrapTight>
+            <wp:docPr id="20" name="图片 20"/>
+            <wp:cNvGraphicFramePr>
+              <a:graphicFrameLocks xmlns:a="http://schemas.openxmlformats.org/drawingml/2006/main" noChangeAspect="1"/>
+            </wp:cNvGraphicFramePr>
+            <a:graphic xmlns:a="http://schemas.openxmlformats.org/drawingml/2006/main">
+              <a:graphicData uri="http://schemas.openxmlformats.org/drawingml/2006/picture">
+                <pic:pic xmlns:pic="http://schemas.openxmlformats.org/drawingml/2006/picture">
+                  <pic:nvPicPr>
+                    <pic:cNvPr id="1" name=""/>
+                    <pic:cNvPicPr/>
+                  </pic:nvPicPr>
+                  <pic:blipFill>
+                    <a:blip r:embed="rId26">
+                      <a:extLst>
+                        <a:ext uri="{28A0092B-C50C-407E-A947-70E740481C1C}">
+                          <a14:useLocalDpi xmlns:a14="http://schemas.microsoft.com/office/drawing/2010/main" val="0"/>
+                        </a:ext>
+                      </a:extLst>
+                    </a:blip>
+                    <a:stretch>
+                      <a:fillRect/>
+                    </a:stretch>
+                  </pic:blipFill>
+                  <pic:spPr>
+                    <a:xfrm>
+                      <a:off x="0" y="0"/>
+                      <a:ext cx="5274310" cy="2094230"/>
+                    </a:xfrm>
+                    <a:prstGeom prst="rect">
+                      <a:avLst/>
+                    </a:prstGeom>
+                  </pic:spPr>
+                </pic:pic>
+              </a:graphicData>
+            </a:graphic>
+          </wp:anchor>
+        </w:drawing>
+      </w:r>
+      <w:r>
+        <w:rPr>
+          <w:rFonts w:cs="宋体" w:hint="eastAsia"/>
+          <w:kern w:val="0"/>
+          <w:szCs w:val="21"/>
+        </w:rPr>
+        <w:t>截图：</w:t>
+      </w:r>
+    </w:p>
+    <w:p>
+      <w:pPr>
+        <w:spacing w:line="400" w:lineRule="exact"/>
+        <w:rPr>
+          <w:rFonts w:cs="宋体"/>
+          <w:kern w:val="0"/>
+          <w:szCs w:val="21"/>
+        </w:rPr>
+      </w:pPr>
+      <w:r>
+        <w:rPr>
+          <w:rFonts w:cs="宋体" w:hint="eastAsia"/>
+          <w:kern w:val="0"/>
+          <w:szCs w:val="21"/>
+        </w:rPr>
+        <w:lastRenderedPageBreak/>
+        <w:t>②</w:t>
+      </w:r>
+      <w:r>
+        <w:rPr>
+          <w:rFonts w:cs="宋体" w:hint="eastAsia"/>
+          <w:kern w:val="0"/>
+          <w:szCs w:val="21"/>
+        </w:rPr>
+        <w:t xml:space="preserve"> </w:t>
+      </w:r>
+      <w:r>
+        <w:rPr>
+          <w:rFonts w:cs="宋体" w:hint="eastAsia"/>
+          <w:kern w:val="0"/>
+          <w:szCs w:val="21"/>
+        </w:rPr>
+        <w:t>将视图</w:t>
+      </w:r>
+      <w:r>
+        <w:rPr>
+          <w:rFonts w:cs="宋体"/>
+          <w:kern w:val="0"/>
+          <w:szCs w:val="21"/>
+        </w:rPr>
+        <w:t>sc</w:t>
+      </w:r>
+      <w:r>
+        <w:rPr>
+          <w:rFonts w:cs="宋体" w:hint="eastAsia"/>
+          <w:kern w:val="0"/>
+          <w:szCs w:val="21"/>
+        </w:rPr>
+        <w:t>_view2</w:t>
+      </w:r>
+      <w:r>
+        <w:rPr>
+          <w:rFonts w:cs="宋体" w:hint="eastAsia"/>
+          <w:kern w:val="0"/>
+          <w:szCs w:val="21"/>
+        </w:rPr>
+        <w:t>中学号为“</w:t>
+      </w:r>
+      <w:r>
+        <w:rPr>
+          <w:rFonts w:cs="宋体" w:hint="eastAsia"/>
+          <w:kern w:val="0"/>
+          <w:szCs w:val="21"/>
+        </w:rPr>
+        <w:t>2007030122</w:t>
+      </w:r>
+      <w:r>
+        <w:rPr>
+          <w:rFonts w:cs="宋体" w:hint="eastAsia"/>
+          <w:kern w:val="0"/>
+          <w:szCs w:val="21"/>
+        </w:rPr>
+        <w:t>”、课程号为“</w:t>
+      </w:r>
+      <w:r>
+        <w:rPr>
+          <w:rFonts w:cs="宋体" w:hint="eastAsia"/>
+          <w:kern w:val="0"/>
+          <w:szCs w:val="21"/>
+        </w:rPr>
+        <w:t>c02</w:t>
+      </w:r>
+      <w:r>
+        <w:rPr>
+          <w:rFonts w:cs="宋体" w:hint="eastAsia"/>
+          <w:kern w:val="0"/>
+          <w:szCs w:val="21"/>
+        </w:rPr>
+        <w:t>”的成绩改为</w:t>
+      </w:r>
+      <w:r>
+        <w:rPr>
+          <w:rFonts w:cs="宋体" w:hint="eastAsia"/>
+          <w:kern w:val="0"/>
+          <w:szCs w:val="21"/>
+        </w:rPr>
+        <w:t>87</w:t>
+      </w:r>
+      <w:r>
+        <w:rPr>
+          <w:rFonts w:cs="宋体" w:hint="eastAsia"/>
+          <w:kern w:val="0"/>
+          <w:szCs w:val="21"/>
+        </w:rPr>
+        <w:t>。</w:t>
+      </w:r>
+    </w:p>
+    <w:p>
+      <w:pPr>
+        <w:spacing w:line="400" w:lineRule="exact"/>
+        <w:rPr>
+          <w:rFonts w:cs="宋体"/>
+          <w:kern w:val="0"/>
+          <w:szCs w:val="21"/>
+        </w:rPr>
+      </w:pPr>
+      <w:r>
+        <w:rPr>
+          <w:rFonts w:cs="宋体" w:hint="eastAsia"/>
+          <w:kern w:val="0"/>
+          <w:szCs w:val="21"/>
+        </w:rPr>
+        <w:t>答：代码：</w:t>
+      </w:r>
+      <w:r>
+        <w:rPr>
+          <w:rFonts w:cs="宋体"/>
+          <w:kern w:val="0"/>
+          <w:szCs w:val="21"/>
+        </w:rPr>
+        <w:t>update sc_view2 set degree = '87' where sno = '2007030122' and cno = 'c02';</w:t>
+      </w:r>
+    </w:p>
+    <w:p>
+      <w:pPr>
+        <w:spacing w:line="400" w:lineRule="exact"/>
+        <w:rPr>
+          <w:rFonts w:cs="宋体" w:hint="eastAsia"/>
+          <w:kern w:val="0"/>
+          <w:szCs w:val="21"/>
+        </w:rPr>
+      </w:pPr>
+      <w:r>
+        <w:rPr>
+          <w:rFonts w:cs="宋体"/>
+          <w:kern w:val="0"/>
+          <w:szCs w:val="21"/>
+        </w:rPr>
+        <w:drawing>
+          <wp:anchor distT="0" distB="0" distL="114300" distR="114300" simplePos="0" relativeHeight="251660800" behindDoc="1" locked="0" layoutInCell="1" allowOverlap="1" wp14:anchorId="5C1043A7" wp14:editId="77004764">
+            <wp:simplePos x="0" y="0"/>
+            <wp:positionH relativeFrom="column">
+              <wp:posOffset>1905</wp:posOffset>
+            </wp:positionH>
+            <wp:positionV relativeFrom="paragraph">
+              <wp:posOffset>287131</wp:posOffset>
+            </wp:positionV>
+            <wp:extent cx="5274310" cy="2218055"/>
+            <wp:effectExtent l="0" t="0" r="2540" b="0"/>
+            <wp:wrapTight wrapText="bothSides">
+              <wp:wrapPolygon edited="0">
+                <wp:start x="0" y="0"/>
+                <wp:lineTo x="0" y="21334"/>
+                <wp:lineTo x="21532" y="21334"/>
+                <wp:lineTo x="21532" y="0"/>
+                <wp:lineTo x="0" y="0"/>
+              </wp:wrapPolygon>
+            </wp:wrapTight>
+            <wp:docPr id="21" name="图片 21"/>
+            <wp:cNvGraphicFramePr>
+              <a:graphicFrameLocks xmlns:a="http://schemas.openxmlformats.org/drawingml/2006/main" noChangeAspect="1"/>
+            </wp:cNvGraphicFramePr>
+            <a:graphic xmlns:a="http://schemas.openxmlformats.org/drawingml/2006/main">
+              <a:graphicData uri="http://schemas.openxmlformats.org/drawingml/2006/picture">
+                <pic:pic xmlns:pic="http://schemas.openxmlformats.org/drawingml/2006/picture">
+                  <pic:nvPicPr>
+                    <pic:cNvPr id="1" name=""/>
+                    <pic:cNvPicPr/>
+                  </pic:nvPicPr>
+                  <pic:blipFill>
+                    <a:blip r:embed="rId27">
+                      <a:extLst>
+                        <a:ext uri="{28A0092B-C50C-407E-A947-70E740481C1C}">
+                          <a14:useLocalDpi xmlns:a14="http://schemas.microsoft.com/office/drawing/2010/main" val="0"/>
+                        </a:ext>
+                      </a:extLst>
+                    </a:blip>
+                    <a:stretch>
+                      <a:fillRect/>
+                    </a:stretch>
+                  </pic:blipFill>
+                  <pic:spPr>
+                    <a:xfrm>
+                      <a:off x="0" y="0"/>
+                      <a:ext cx="5274310" cy="2218055"/>
+                    </a:xfrm>
+                    <a:prstGeom prst="rect">
+                      <a:avLst/>
+                    </a:prstGeom>
+                  </pic:spPr>
+                </pic:pic>
+              </a:graphicData>
+            </a:graphic>
+          </wp:anchor>
+        </w:drawing>
+      </w:r>
+      <w:r>
+        <w:rPr>
+          <w:rFonts w:cs="宋体" w:hint="eastAsia"/>
+          <w:kern w:val="0"/>
+          <w:szCs w:val="21"/>
+        </w:rPr>
+        <w:t>截图：</w:t>
+      </w:r>
+    </w:p>
+    <w:p>
+      <w:pPr>
+        <w:spacing w:line="400" w:lineRule="exact"/>
+        <w:rPr>
+          <w:rFonts w:cs="宋体"/>
+          <w:kern w:val="0"/>
+          <w:szCs w:val="21"/>
+        </w:rPr>
+      </w:pPr>
+      <w:r>
+        <w:rPr>
+          <w:rFonts w:cs="宋体" w:hint="eastAsia"/>
+          <w:kern w:val="0"/>
+          <w:szCs w:val="21"/>
+        </w:rPr>
+        <w:t>③</w:t>
+      </w:r>
+      <w:r>
+        <w:rPr>
+          <w:rFonts w:cs="宋体" w:hint="eastAsia"/>
+          <w:kern w:val="0"/>
+          <w:szCs w:val="21"/>
+        </w:rPr>
+        <w:t xml:space="preserve"> </w:t>
+      </w:r>
+      <w:r>
+        <w:rPr>
+          <w:rFonts w:cs="宋体" w:hint="eastAsia"/>
+          <w:kern w:val="0"/>
+          <w:szCs w:val="21"/>
+        </w:rPr>
+        <w:t>从视图</w:t>
+      </w:r>
+      <w:r>
+        <w:rPr>
+          <w:rFonts w:cs="宋体"/>
+          <w:kern w:val="0"/>
+          <w:szCs w:val="21"/>
+        </w:rPr>
+        <w:t>sc</w:t>
+      </w:r>
+      <w:r>
+        <w:rPr>
+          <w:rFonts w:cs="宋体" w:hint="eastAsia"/>
+          <w:kern w:val="0"/>
+          <w:szCs w:val="21"/>
+        </w:rPr>
+        <w:t>_view2</w:t>
+      </w:r>
+      <w:r>
+        <w:rPr>
+          <w:rFonts w:cs="宋体" w:hint="eastAsia"/>
+          <w:kern w:val="0"/>
+          <w:szCs w:val="21"/>
+        </w:rPr>
+        <w:t>中将学号为“</w:t>
+      </w:r>
+      <w:r>
+        <w:rPr>
+          <w:rFonts w:cs="宋体" w:hint="eastAsia"/>
+          <w:kern w:val="0"/>
+          <w:szCs w:val="21"/>
+        </w:rPr>
+        <w:t>2007030123</w:t>
+      </w:r>
+      <w:r>
+        <w:rPr>
+          <w:rFonts w:cs="宋体" w:hint="eastAsia"/>
+          <w:kern w:val="0"/>
+          <w:szCs w:val="21"/>
+        </w:rPr>
+        <w:t>”、课程号为“</w:t>
+      </w:r>
+      <w:r>
+        <w:rPr>
+          <w:rFonts w:cs="宋体" w:hint="eastAsia"/>
+          <w:kern w:val="0"/>
+          <w:szCs w:val="21"/>
+        </w:rPr>
+        <w:t>a01</w:t>
+      </w:r>
+      <w:r>
+        <w:rPr>
+          <w:rFonts w:cs="宋体" w:hint="eastAsia"/>
+          <w:kern w:val="0"/>
+          <w:szCs w:val="21"/>
+        </w:rPr>
+        <w:t>”的学生信息删除。</w:t>
+      </w:r>
+    </w:p>
+    <w:p>
+      <w:pPr>
+        <w:spacing w:line="400" w:lineRule="exact"/>
+        <w:rPr>
+          <w:rFonts w:cs="宋体"/>
+          <w:kern w:val="0"/>
+          <w:szCs w:val="21"/>
+        </w:rPr>
+      </w:pPr>
+      <w:r>
+        <w:rPr>
+          <w:rFonts w:cs="宋体" w:hint="eastAsia"/>
+          <w:kern w:val="0"/>
+          <w:szCs w:val="21"/>
+        </w:rPr>
+        <w:t>答：代码：</w:t>
+      </w:r>
+      <w:r>
+        <w:rPr>
+          <w:rFonts w:cs="宋体"/>
+          <w:kern w:val="0"/>
+          <w:szCs w:val="21"/>
+        </w:rPr>
+        <w:t>delete from sc_view2 where sno = '2007030123' and cno = 'a01';</w:t>
+      </w:r>
+    </w:p>
+    <w:p>
+      <w:pPr>
+        <w:spacing w:line="400" w:lineRule="exact"/>
+        <w:rPr>
+          <w:rFonts w:cs="宋体" w:hint="eastAsia"/>
+          <w:kern w:val="0"/>
+          <w:szCs w:val="21"/>
+        </w:rPr>
+      </w:pPr>
+      <w:r>
+        <w:rPr>
+          <w:color w:val="000000"/>
+        </w:rPr>
+        <w:drawing>
+          <wp:anchor distT="0" distB="0" distL="114300" distR="114300" simplePos="0" relativeHeight="251661824" behindDoc="1" locked="0" layoutInCell="1" allowOverlap="1" wp14:anchorId="41CABF84" wp14:editId="1A2209BE">
+            <wp:simplePos x="0" y="0"/>
+            <wp:positionH relativeFrom="column">
+              <wp:posOffset>1905</wp:posOffset>
+            </wp:positionH>
+            <wp:positionV relativeFrom="paragraph">
+              <wp:posOffset>300410</wp:posOffset>
+            </wp:positionV>
+            <wp:extent cx="5274310" cy="2011045"/>
+            <wp:effectExtent l="0" t="0" r="2540" b="8255"/>
+            <wp:wrapTight wrapText="bothSides">
+              <wp:wrapPolygon edited="0">
+                <wp:start x="0" y="0"/>
+                <wp:lineTo x="0" y="21484"/>
+                <wp:lineTo x="21532" y="21484"/>
+                <wp:lineTo x="21532" y="0"/>
+                <wp:lineTo x="0" y="0"/>
+              </wp:wrapPolygon>
+            </wp:wrapTight>
+            <wp:docPr id="22" name="图片 22"/>
+            <wp:cNvGraphicFramePr>
+              <a:graphicFrameLocks xmlns:a="http://schemas.openxmlformats.org/drawingml/2006/main" noChangeAspect="1"/>
+            </wp:cNvGraphicFramePr>
+            <a:graphic xmlns:a="http://schemas.openxmlformats.org/drawingml/2006/main">
+              <a:graphicData uri="http://schemas.openxmlformats.org/drawingml/2006/picture">
+                <pic:pic xmlns:pic="http://schemas.openxmlformats.org/drawingml/2006/picture">
+                  <pic:nvPicPr>
+                    <pic:cNvPr id="1" name=""/>
+                    <pic:cNvPicPr/>
+                  </pic:nvPicPr>
+                  <pic:blipFill>
+                    <a:blip r:embed="rId28">
+                      <a:extLst>
+                        <a:ext uri="{28A0092B-C50C-407E-A947-70E740481C1C}">
+                          <a14:useLocalDpi xmlns:a14="http://schemas.microsoft.com/office/drawing/2010/main" val="0"/>
+                        </a:ext>
+                      </a:extLst>
+                    </a:blip>
+                    <a:stretch>
+                      <a:fillRect/>
+                    </a:stretch>
+                  </pic:blipFill>
+                  <pic:spPr>
+                    <a:xfrm>
+                      <a:off x="0" y="0"/>
+                      <a:ext cx="5274310" cy="2011045"/>
+                    </a:xfrm>
+                    <a:prstGeom prst="rect">
+                      <a:avLst/>
+                    </a:prstGeom>
+                  </pic:spPr>
+                </pic:pic>
+              </a:graphicData>
+            </a:graphic>
+          </wp:anchor>
+        </w:drawing>
+      </w:r>
+      <w:r>
+        <w:rPr>
+          <w:rFonts w:cs="宋体" w:hint="eastAsia"/>
+          <w:kern w:val="0"/>
+          <w:szCs w:val="21"/>
+        </w:rPr>
+        <w:t>截图：</w:t>
+      </w:r>
+    </w:p>
+    <w:p>
+      <w:pPr>
+        <w:spacing w:line="400" w:lineRule="exact"/>
+        <w:rPr>
+          <w:color w:val="000000"/>
+        </w:rPr>
+      </w:pPr>
+    </w:p>
+    <w:p>
+      <w:pPr>
+        <w:spacing w:line="400" w:lineRule="exact"/>
+        <w:rPr>
+          <w:b/>
+          <w:color w:val="000000"/>
+        </w:rPr>
+      </w:pPr>
+      <w:r>
+        <w:rPr>
+          <w:rFonts w:hint="eastAsia"/>
+          <w:b/>
+          <w:color w:val="000000"/>
+        </w:rPr>
+        <w:t>四、实验中遇到的问题和解决方法以及心得体会</w:t>
+      </w:r>
+    </w:p>
+    <w:p>
+      <w:pPr>
+        <w:spacing w:line="400" w:lineRule="exact"/>
+        <w:rPr>
+          <w:rFonts w:cs="宋体"/>
+          <w:kern w:val="0"/>
+          <w:szCs w:val="21"/>
+        </w:rPr>
+      </w:pPr>
+      <w:r>
+        <w:rPr>
+          <w:rFonts w:cs="宋体" w:hint="eastAsia"/>
+          <w:kern w:val="0"/>
+          <w:szCs w:val="21"/>
+        </w:rPr>
+        <w:t>(1)  DROP</w:t>
+      </w:r>
+      <w:r>
+        <w:rPr>
+          <w:rFonts w:cs="宋体" w:hint="eastAsia"/>
+          <w:kern w:val="0"/>
+          <w:szCs w:val="21"/>
+        </w:rPr>
+        <w:t>命令和</w:t>
+      </w:r>
+      <w:r>
+        <w:rPr>
+          <w:rFonts w:cs="宋体" w:hint="eastAsia"/>
+          <w:kern w:val="0"/>
+          <w:szCs w:val="21"/>
+        </w:rPr>
+        <w:t>DELETE</w:t>
+      </w:r>
+      <w:r>
+        <w:rPr>
+          <w:rFonts w:cs="宋体" w:hint="eastAsia"/>
+          <w:kern w:val="0"/>
+          <w:szCs w:val="21"/>
+        </w:rPr>
+        <w:t>命令的本质区别是什么？</w:t>
+      </w:r>
+    </w:p>
+    <w:p>
+      <w:pPr>
+        <w:spacing w:line="400" w:lineRule="exact"/>
+        <w:rPr>
+          <w:rFonts w:cs="宋体" w:hint="eastAsia"/>
+          <w:kern w:val="0"/>
+          <w:szCs w:val="21"/>
+        </w:rPr>
+      </w:pPr>
+      <w:r>
+        <w:rPr>
+          <w:rFonts w:cs="宋体" w:hint="eastAsia"/>
+          <w:kern w:val="0"/>
+          <w:szCs w:val="21"/>
+        </w:rPr>
+        <w:t>答：</w:t>
+      </w:r>
+      <w:r>
+        <w:rPr>
+          <w:rFonts w:cs="宋体" w:hint="eastAsia"/>
+          <w:kern w:val="0"/>
+          <w:szCs w:val="21"/>
+        </w:rPr>
+        <w:t>DELETE</w:t>
+      </w:r>
+      <w:r>
+        <w:rPr>
+          <w:rFonts w:cs="宋体" w:hint="eastAsia"/>
+          <w:kern w:val="0"/>
+          <w:szCs w:val="21"/>
+        </w:rPr>
+        <w:t>：是</w:t>
+      </w:r>
+      <w:r>
+        <w:rPr>
+          <w:rFonts w:cs="宋体" w:hint="eastAsia"/>
+          <w:kern w:val="0"/>
+          <w:szCs w:val="21"/>
+        </w:rPr>
+        <w:t xml:space="preserve"> DML</w:t>
+      </w:r>
+      <w:r>
+        <w:rPr>
+          <w:rFonts w:cs="宋体" w:hint="eastAsia"/>
+          <w:kern w:val="0"/>
+          <w:szCs w:val="21"/>
+        </w:rPr>
+        <w:t>（数据操作语言）。它只删除表里的数据（行），表的结构（列、索引等）还在。它可以加</w:t>
+      </w:r>
+      <w:r>
+        <w:rPr>
+          <w:rFonts w:cs="宋体" w:hint="eastAsia"/>
+          <w:kern w:val="0"/>
+          <w:szCs w:val="21"/>
+        </w:rPr>
+        <w:t xml:space="preserve"> WHERE </w:t>
+      </w:r>
+      <w:r>
+        <w:rPr>
+          <w:rFonts w:cs="宋体" w:hint="eastAsia"/>
+          <w:kern w:val="0"/>
+          <w:szCs w:val="21"/>
+        </w:rPr>
+        <w:t>条件删除部分数据，且可以被事务回滚（</w:t>
+      </w:r>
+      <w:r>
+        <w:rPr>
+          <w:rFonts w:cs="宋体" w:hint="eastAsia"/>
+          <w:kern w:val="0"/>
+          <w:szCs w:val="21"/>
+        </w:rPr>
+        <w:t>ROLLBACK</w:t>
+      </w:r>
+      <w:r>
+        <w:rPr>
+          <w:rFonts w:cs="宋体" w:hint="eastAsia"/>
+          <w:kern w:val="0"/>
+          <w:szCs w:val="21"/>
+        </w:rPr>
+        <w:t>）。</w:t>
+      </w:r>
+    </w:p>
+    <w:p>
+      <w:pPr>
+        <w:spacing w:line="400" w:lineRule="exact"/>
+        <w:rPr>
+          <w:rFonts w:cs="宋体"/>
+          <w:kern w:val="0"/>
+          <w:szCs w:val="21"/>
+        </w:rPr>
+      </w:pPr>
+      <w:r>
+        <w:rPr>
+          <w:rFonts w:cs="宋体" w:hint="eastAsia"/>
+          <w:kern w:val="0"/>
+          <w:szCs w:val="21"/>
+        </w:rPr>
+        <w:t>DROP</w:t>
+      </w:r>
+      <w:r>
+        <w:rPr>
+          <w:rFonts w:cs="宋体" w:hint="eastAsia"/>
+          <w:kern w:val="0"/>
+          <w:szCs w:val="21"/>
+        </w:rPr>
+        <w:t>：是</w:t>
+      </w:r>
+      <w:r>
+        <w:rPr>
+          <w:rFonts w:cs="宋体" w:hint="eastAsia"/>
+          <w:kern w:val="0"/>
+          <w:szCs w:val="21"/>
+        </w:rPr>
+        <w:t xml:space="preserve"> DDL</w:t>
+      </w:r>
+      <w:r>
+        <w:rPr>
+          <w:rFonts w:cs="宋体" w:hint="eastAsia"/>
+          <w:kern w:val="0"/>
+          <w:szCs w:val="21"/>
+        </w:rPr>
+        <w:t>（数据定义语言）。它是用来摧毁整个表的，表结构和数据全都没了，就像把房子连地基一起推平。它不能回滚，执行极快。</w:t>
+      </w:r>
+    </w:p>
+    <w:p>
+      <w:pPr>
+        <w:spacing w:line="400" w:lineRule="exact"/>
+        <w:rPr>
+          <w:rFonts w:cs="宋体" w:hint="eastAsia"/>
+          <w:kern w:val="0"/>
+          <w:szCs w:val="21"/>
+        </w:rPr>
+      </w:pPr>
+    </w:p>
+    <w:p>
+      <w:pPr>
+        <w:spacing w:line="400" w:lineRule="exact"/>
+        <w:rPr>
+          <w:rFonts w:cs="宋体"/>
+          <w:kern w:val="0"/>
+          <w:szCs w:val="21"/>
+        </w:rPr>
+      </w:pPr>
+      <w:r>
+        <w:rPr>
+          <w:rFonts w:cs="宋体" w:hint="eastAsia"/>
+          <w:kern w:val="0"/>
+          <w:szCs w:val="21"/>
+        </w:rPr>
+        <w:t xml:space="preserve">(2) </w:t>
+      </w:r>
+      <w:r>
+        <w:rPr>
+          <w:rFonts w:cs="宋体" w:hint="eastAsia"/>
+          <w:kern w:val="0"/>
+          <w:szCs w:val="21"/>
+        </w:rPr>
+        <w:t>利用</w:t>
+      </w:r>
+      <w:r>
+        <w:rPr>
+          <w:rFonts w:cs="宋体" w:hint="eastAsia"/>
+          <w:kern w:val="0"/>
+          <w:szCs w:val="21"/>
+        </w:rPr>
+        <w:t>INSERT</w:t>
+      </w:r>
+      <w:r>
+        <w:rPr>
+          <w:rFonts w:cs="宋体" w:hint="eastAsia"/>
+          <w:kern w:val="0"/>
+          <w:szCs w:val="21"/>
+        </w:rPr>
+        <w:t>、</w:t>
+      </w:r>
+      <w:r>
+        <w:rPr>
+          <w:rFonts w:cs="宋体" w:hint="eastAsia"/>
+          <w:kern w:val="0"/>
+          <w:szCs w:val="21"/>
+        </w:rPr>
+        <w:t>UPDATE</w:t>
+      </w:r>
+      <w:r>
+        <w:rPr>
+          <w:rFonts w:cs="宋体" w:hint="eastAsia"/>
+          <w:kern w:val="0"/>
+          <w:szCs w:val="21"/>
+        </w:rPr>
+        <w:t>和</w:t>
+      </w:r>
+      <w:r>
+        <w:rPr>
+          <w:rFonts w:cs="宋体" w:hint="eastAsia"/>
+          <w:kern w:val="0"/>
+          <w:szCs w:val="21"/>
+        </w:rPr>
+        <w:t>DELETE</w:t>
+      </w:r>
+      <w:r>
+        <w:rPr>
+          <w:rFonts w:cs="宋体" w:hint="eastAsia"/>
+          <w:kern w:val="0"/>
+          <w:szCs w:val="21"/>
+        </w:rPr>
+        <w:t>命令可以同时对多个表进行操作吗？</w:t>
+      </w:r>
+    </w:p>
+    <w:p>
+      <w:pPr>
+        <w:spacing w:line="400" w:lineRule="exact"/>
+        <w:rPr>
+          <w:rFonts w:cs="宋体" w:hint="eastAsia"/>
+          <w:kern w:val="0"/>
+          <w:szCs w:val="21"/>
+        </w:rPr>
+      </w:pPr>
+      <w:r>
+        <w:rPr>
+          <w:rFonts w:cs="宋体" w:hint="eastAsia"/>
+          <w:kern w:val="0"/>
+          <w:szCs w:val="21"/>
+        </w:rPr>
+        <w:t>答：</w:t>
+      </w:r>
+      <w:r>
+        <w:rPr>
+          <w:rFonts w:cs="宋体" w:hint="eastAsia"/>
+          <w:kern w:val="0"/>
+          <w:szCs w:val="21"/>
+        </w:rPr>
+        <w:t>在标准单句</w:t>
+      </w:r>
+      <w:r>
+        <w:rPr>
+          <w:rFonts w:cs="宋体" w:hint="eastAsia"/>
+          <w:kern w:val="0"/>
+          <w:szCs w:val="21"/>
+        </w:rPr>
+        <w:t xml:space="preserve"> SQL </w:t>
+      </w:r>
+      <w:r>
+        <w:rPr>
+          <w:rFonts w:cs="宋体" w:hint="eastAsia"/>
+          <w:kern w:val="0"/>
+          <w:szCs w:val="21"/>
+        </w:rPr>
+        <w:t>中，直接针对多表进行增删改是不行的（一次只能操作一张表）。</w:t>
+      </w:r>
+    </w:p>
+    <w:p>
+      <w:pPr>
+        <w:spacing w:line="400" w:lineRule="exact"/>
+        <w:rPr>
+          <w:rFonts w:cs="宋体"/>
+          <w:kern w:val="0"/>
+          <w:szCs w:val="21"/>
+        </w:rPr>
+      </w:pPr>
+      <w:r>
+        <w:rPr>
+          <w:rFonts w:cs="宋体" w:hint="eastAsia"/>
+          <w:kern w:val="0"/>
+          <w:szCs w:val="21"/>
+        </w:rPr>
+        <w:lastRenderedPageBreak/>
+        <w:t>但是，可以通过子查询（如本题中根据学生表删选课表）、多表连接语法（如</w:t>
+      </w:r>
+      <w:r>
+        <w:rPr>
+          <w:rFonts w:cs="宋体" w:hint="eastAsia"/>
+          <w:kern w:val="0"/>
+          <w:szCs w:val="21"/>
+        </w:rPr>
+        <w:t xml:space="preserve"> UPDATE t1 JOIN t2 SET...</w:t>
+      </w:r>
+      <w:r>
+        <w:rPr>
+          <w:rFonts w:cs="宋体" w:hint="eastAsia"/>
+          <w:kern w:val="0"/>
+          <w:szCs w:val="21"/>
+        </w:rPr>
+        <w:t>）或者编写触发器（</w:t>
+      </w:r>
+      <w:r>
+        <w:rPr>
+          <w:rFonts w:cs="宋体" w:hint="eastAsia"/>
+          <w:kern w:val="0"/>
+          <w:szCs w:val="21"/>
+        </w:rPr>
+        <w:t>Trigger</w:t>
+      </w:r>
+      <w:r>
+        <w:rPr>
+          <w:rFonts w:cs="宋体" w:hint="eastAsia"/>
+          <w:kern w:val="0"/>
+          <w:szCs w:val="21"/>
+        </w:rPr>
+        <w:t>）来实现“操作一张表时，影响另一张表”。</w:t>
+      </w:r>
+    </w:p>
+    <w:p>
+      <w:pPr>
+        <w:spacing w:line="400" w:lineRule="exact"/>
+        <w:rPr>
+          <w:rFonts w:cs="宋体"/>
+          <w:kern w:val="0"/>
+          <w:szCs w:val="21"/>
+        </w:rPr>
+      </w:pPr>
+    </w:p>
+    <w:p>
+      <w:pPr>
+        <w:spacing w:line="400" w:lineRule="exact"/>
+        <w:rPr>
+          <w:rFonts w:cs="宋体"/>
+          <w:kern w:val="0"/>
+          <w:szCs w:val="21"/>
+        </w:rPr>
+      </w:pPr>
+      <w:r>
+        <w:rPr>
+          <w:rFonts w:cs="宋体" w:hint="eastAsia"/>
+          <w:kern w:val="0"/>
+          <w:szCs w:val="21"/>
+        </w:rPr>
+        <w:t xml:space="preserve">(3) </w:t>
+      </w:r>
+      <w:r>
+        <w:rPr>
+          <w:rFonts w:cs="宋体" w:hint="eastAsia"/>
+          <w:kern w:val="0"/>
+          <w:szCs w:val="21"/>
+        </w:rPr>
+        <w:t>视图上能创建索引吗？</w:t>
+      </w:r>
+    </w:p>
+    <w:p>
+      <w:pPr>
+        <w:spacing w:line="400" w:lineRule="exact"/>
+        <w:rPr>
+          <w:rFonts w:cs="宋体"/>
+          <w:kern w:val="0"/>
+          <w:szCs w:val="21"/>
+        </w:rPr>
+      </w:pPr>
+      <w:r>
+        <w:rPr>
+          <w:rFonts w:cs="宋体" w:hint="eastAsia"/>
+          <w:kern w:val="0"/>
+          <w:szCs w:val="21"/>
+        </w:rPr>
+        <w:t>答：</w:t>
+      </w:r>
+      <w:r>
+        <w:rPr>
+          <w:rFonts w:cs="宋体" w:hint="eastAsia"/>
+          <w:kern w:val="0"/>
+          <w:szCs w:val="21"/>
+        </w:rPr>
+        <w:t>不能。视图本身是“虚拟表”，它不存储任何真实数据，只保存了一条</w:t>
+      </w:r>
+      <w:r>
+        <w:rPr>
+          <w:rFonts w:cs="宋体" w:hint="eastAsia"/>
+          <w:kern w:val="0"/>
+          <w:szCs w:val="21"/>
+        </w:rPr>
+        <w:t xml:space="preserve"> SQL </w:t>
+      </w:r>
+      <w:r>
+        <w:rPr>
+          <w:rFonts w:cs="宋体" w:hint="eastAsia"/>
+          <w:kern w:val="0"/>
+          <w:szCs w:val="21"/>
+        </w:rPr>
+        <w:t>查询语句。而索引是建立在物理存储的数据之上的，所以只能对真实的基本表创建索引。</w:t>
+      </w:r>
+    </w:p>
+    <w:p>
+      <w:pPr>
+        <w:spacing w:line="400" w:lineRule="exact"/>
+        <w:rPr>
+          <w:rFonts w:cs="宋体" w:hint="eastAsia"/>
+          <w:kern w:val="0"/>
+          <w:szCs w:val="21"/>
+        </w:rPr>
+      </w:pPr>
     </w:p>
     <w:p>
       <w:pPr>
@@ -6205,479 +7833,137 @@
           <w:kern w:val="0"/>
           <w:szCs w:val="21"/>
         </w:rPr>
-        <w:t>管理视图中的数据。</w:t>
-      </w:r>
-    </w:p>
-    <w:p>
-      <w:pPr>
-        <w:spacing w:line="400" w:lineRule="exact"/>
-        <w:rPr>
-          <w:rFonts w:cs="宋体"/>
-          <w:kern w:val="0"/>
-          <w:szCs w:val="21"/>
-        </w:rPr>
-      </w:pPr>
-      <w:r>
-        <w:rPr>
-          <w:rFonts w:cs="宋体" w:hint="eastAsia"/>
-          <w:kern w:val="0"/>
-          <w:szCs w:val="21"/>
-        </w:rPr>
-        <w:t>①</w:t>
-      </w:r>
-      <w:r>
-        <w:rPr>
-          <w:rFonts w:cs="宋体" w:hint="eastAsia"/>
-          <w:kern w:val="0"/>
-          <w:szCs w:val="21"/>
-        </w:rPr>
-        <w:t xml:space="preserve"> </w:t>
-      </w:r>
-      <w:r>
-        <w:rPr>
-          <w:rFonts w:cs="宋体" w:hint="eastAsia"/>
-          <w:kern w:val="0"/>
-          <w:szCs w:val="21"/>
-        </w:rPr>
-        <w:t>从视图</w:t>
-      </w:r>
-      <w:r>
-        <w:rPr>
-          <w:rFonts w:cs="宋体"/>
-          <w:kern w:val="0"/>
-          <w:szCs w:val="21"/>
-        </w:rPr>
-        <w:t>sc</w:t>
-      </w:r>
-      <w:r>
-        <w:rPr>
-          <w:rFonts w:cs="宋体" w:hint="eastAsia"/>
-          <w:kern w:val="0"/>
-          <w:szCs w:val="21"/>
-        </w:rPr>
-        <w:t>_view2</w:t>
-      </w:r>
-      <w:r>
-        <w:rPr>
-          <w:rFonts w:cs="宋体" w:hint="eastAsia"/>
-          <w:kern w:val="0"/>
-          <w:szCs w:val="21"/>
-        </w:rPr>
-        <w:t>中查询出学号为“</w:t>
-      </w:r>
-      <w:r>
-        <w:rPr>
-          <w:rFonts w:cs="宋体" w:hint="eastAsia"/>
-          <w:kern w:val="0"/>
-          <w:szCs w:val="21"/>
-        </w:rPr>
-        <w:t>2007030125</w:t>
-      </w:r>
-      <w:r>
-        <w:rPr>
-          <w:rFonts w:cs="宋体" w:hint="eastAsia"/>
-          <w:kern w:val="0"/>
-          <w:szCs w:val="21"/>
-        </w:rPr>
-        <w:t>”、课程号为“</w:t>
-      </w:r>
-      <w:r>
-        <w:rPr>
-          <w:rFonts w:cs="宋体" w:hint="eastAsia"/>
-          <w:kern w:val="0"/>
-          <w:szCs w:val="21"/>
-        </w:rPr>
-        <w:t>a01</w:t>
-      </w:r>
-      <w:r>
-        <w:rPr>
-          <w:rFonts w:cs="宋体" w:hint="eastAsia"/>
-          <w:kern w:val="0"/>
-          <w:szCs w:val="21"/>
-        </w:rPr>
-        <w:t>”的学生选修成绩的</w:t>
-      </w:r>
-      <w:r>
-        <w:rPr>
-          <w:rFonts w:cs="宋体" w:hint="eastAsia"/>
-          <w:kern w:val="0"/>
-          <w:szCs w:val="21"/>
-        </w:rPr>
-        <w:lastRenderedPageBreak/>
-        <w:t>信息。</w:t>
-      </w:r>
-    </w:p>
-    <w:p>
-      <w:pPr>
-        <w:spacing w:line="400" w:lineRule="exact"/>
-        <w:rPr>
-          <w:rFonts w:cs="宋体"/>
-          <w:kern w:val="0"/>
-          <w:szCs w:val="21"/>
-        </w:rPr>
-      </w:pPr>
-    </w:p>
-    <w:p>
-      <w:pPr>
-        <w:spacing w:line="400" w:lineRule="exact"/>
-        <w:rPr>
-          <w:rFonts w:cs="宋体"/>
-          <w:kern w:val="0"/>
-          <w:szCs w:val="21"/>
-        </w:rPr>
-      </w:pPr>
-    </w:p>
-    <w:p>
-      <w:pPr>
-        <w:spacing w:line="400" w:lineRule="exact"/>
-        <w:rPr>
-          <w:rFonts w:cs="宋体"/>
-          <w:kern w:val="0"/>
-          <w:szCs w:val="21"/>
-        </w:rPr>
-      </w:pPr>
-      <w:r>
-        <w:rPr>
-          <w:rFonts w:cs="宋体" w:hint="eastAsia"/>
-          <w:kern w:val="0"/>
-          <w:szCs w:val="21"/>
-        </w:rPr>
-        <w:t>②</w:t>
-      </w:r>
-      <w:r>
-        <w:rPr>
-          <w:rFonts w:cs="宋体" w:hint="eastAsia"/>
-          <w:kern w:val="0"/>
-          <w:szCs w:val="21"/>
-        </w:rPr>
-        <w:t xml:space="preserve"> </w:t>
-      </w:r>
-      <w:r>
-        <w:rPr>
-          <w:rFonts w:cs="宋体" w:hint="eastAsia"/>
-          <w:kern w:val="0"/>
-          <w:szCs w:val="21"/>
-        </w:rPr>
-        <w:t>将视图</w:t>
-      </w:r>
-      <w:r>
-        <w:rPr>
-          <w:rFonts w:cs="宋体"/>
-          <w:kern w:val="0"/>
-          <w:szCs w:val="21"/>
-        </w:rPr>
-        <w:t>sc</w:t>
-      </w:r>
-      <w:r>
-        <w:rPr>
-          <w:rFonts w:cs="宋体" w:hint="eastAsia"/>
-          <w:kern w:val="0"/>
-          <w:szCs w:val="21"/>
-        </w:rPr>
-        <w:t>_view2</w:t>
-      </w:r>
-      <w:r>
-        <w:rPr>
-          <w:rFonts w:cs="宋体" w:hint="eastAsia"/>
-          <w:kern w:val="0"/>
-          <w:szCs w:val="21"/>
-        </w:rPr>
-        <w:t>中学号为“</w:t>
-      </w:r>
-      <w:r>
-        <w:rPr>
-          <w:rFonts w:cs="宋体" w:hint="eastAsia"/>
-          <w:kern w:val="0"/>
-          <w:szCs w:val="21"/>
-        </w:rPr>
-        <w:t>2007030122</w:t>
-      </w:r>
-      <w:r>
-        <w:rPr>
-          <w:rFonts w:cs="宋体" w:hint="eastAsia"/>
-          <w:kern w:val="0"/>
-          <w:szCs w:val="21"/>
-        </w:rPr>
-        <w:t>”、课程号为“</w:t>
-      </w:r>
-      <w:r>
-        <w:rPr>
-          <w:rFonts w:cs="宋体" w:hint="eastAsia"/>
-          <w:kern w:val="0"/>
-          <w:szCs w:val="21"/>
-        </w:rPr>
-        <w:t>c02</w:t>
-      </w:r>
-      <w:r>
-        <w:rPr>
-          <w:rFonts w:cs="宋体" w:hint="eastAsia"/>
-          <w:kern w:val="0"/>
-          <w:szCs w:val="21"/>
-        </w:rPr>
-        <w:t>”的成绩改为</w:t>
-      </w:r>
-      <w:r>
-        <w:rPr>
-          <w:rFonts w:cs="宋体" w:hint="eastAsia"/>
-          <w:kern w:val="0"/>
-          <w:szCs w:val="21"/>
-        </w:rPr>
-        <w:t>87</w:t>
-      </w:r>
-      <w:r>
-        <w:rPr>
-          <w:rFonts w:cs="宋体" w:hint="eastAsia"/>
-          <w:kern w:val="0"/>
-          <w:szCs w:val="21"/>
-        </w:rPr>
-        <w:t>。</w:t>
-      </w:r>
-    </w:p>
-    <w:p>
-      <w:pPr>
-        <w:spacing w:line="400" w:lineRule="exact"/>
-        <w:rPr>
-          <w:rFonts w:cs="宋体"/>
-          <w:kern w:val="0"/>
-          <w:szCs w:val="21"/>
-        </w:rPr>
-      </w:pPr>
-    </w:p>
-    <w:p>
-      <w:pPr>
-        <w:spacing w:line="400" w:lineRule="exact"/>
-        <w:rPr>
-          <w:rFonts w:cs="宋体"/>
-          <w:kern w:val="0"/>
-          <w:szCs w:val="21"/>
-        </w:rPr>
-      </w:pPr>
-    </w:p>
-    <w:p>
-      <w:pPr>
-        <w:spacing w:line="400" w:lineRule="exact"/>
-        <w:rPr>
-          <w:rFonts w:cs="宋体"/>
-          <w:kern w:val="0"/>
-          <w:szCs w:val="21"/>
-        </w:rPr>
-      </w:pPr>
-    </w:p>
-    <w:p>
-      <w:pPr>
-        <w:spacing w:line="400" w:lineRule="exact"/>
-        <w:rPr>
-          <w:rFonts w:cs="宋体"/>
-          <w:kern w:val="0"/>
-          <w:szCs w:val="21"/>
-        </w:rPr>
-      </w:pPr>
-      <w:r>
-        <w:rPr>
-          <w:rFonts w:cs="宋体" w:hint="eastAsia"/>
-          <w:kern w:val="0"/>
-          <w:szCs w:val="21"/>
-        </w:rPr>
-        <w:t>③</w:t>
-      </w:r>
-      <w:r>
-        <w:rPr>
-          <w:rFonts w:cs="宋体" w:hint="eastAsia"/>
-          <w:kern w:val="0"/>
-          <w:szCs w:val="21"/>
-        </w:rPr>
-        <w:t xml:space="preserve"> </w:t>
-      </w:r>
-      <w:r>
-        <w:rPr>
-          <w:rFonts w:cs="宋体" w:hint="eastAsia"/>
-          <w:kern w:val="0"/>
-          <w:szCs w:val="21"/>
-        </w:rPr>
-        <w:t>从视图</w:t>
-      </w:r>
-      <w:r>
-        <w:rPr>
-          <w:rFonts w:cs="宋体"/>
-          <w:kern w:val="0"/>
-          <w:szCs w:val="21"/>
-        </w:rPr>
-        <w:t>sc</w:t>
-      </w:r>
-      <w:r>
-        <w:rPr>
-          <w:rFonts w:cs="宋体" w:hint="eastAsia"/>
-          <w:kern w:val="0"/>
-          <w:szCs w:val="21"/>
-        </w:rPr>
-        <w:t>_view2</w:t>
-      </w:r>
-      <w:r>
-        <w:rPr>
-          <w:rFonts w:cs="宋体" w:hint="eastAsia"/>
-          <w:kern w:val="0"/>
-          <w:szCs w:val="21"/>
-        </w:rPr>
-        <w:t>中将学号为“</w:t>
-      </w:r>
-      <w:r>
-        <w:rPr>
-          <w:rFonts w:cs="宋体" w:hint="eastAsia"/>
-          <w:kern w:val="0"/>
-          <w:szCs w:val="21"/>
-        </w:rPr>
-        <w:t>2007030123</w:t>
-      </w:r>
-      <w:r>
-        <w:rPr>
-          <w:rFonts w:cs="宋体" w:hint="eastAsia"/>
-          <w:kern w:val="0"/>
-          <w:szCs w:val="21"/>
-        </w:rPr>
-        <w:t>”、课程号为“</w:t>
-      </w:r>
-      <w:r>
-        <w:rPr>
-          <w:rFonts w:cs="宋体" w:hint="eastAsia"/>
-          <w:kern w:val="0"/>
-          <w:szCs w:val="21"/>
-        </w:rPr>
-        <w:t>a01</w:t>
-      </w:r>
-      <w:r>
-        <w:rPr>
-          <w:rFonts w:cs="宋体" w:hint="eastAsia"/>
-          <w:kern w:val="0"/>
-          <w:szCs w:val="21"/>
-        </w:rPr>
-        <w:t>”的学生信息删除。</w:t>
-      </w:r>
-    </w:p>
-    <w:p>
-      <w:pPr>
-        <w:spacing w:line="400" w:lineRule="exact"/>
-        <w:rPr>
-          <w:color w:val="000000"/>
-        </w:rPr>
-      </w:pPr>
-    </w:p>
-    <w:p>
-      <w:pPr>
-        <w:spacing w:line="400" w:lineRule="exact"/>
-        <w:rPr>
-          <w:color w:val="000000"/>
-        </w:rPr>
-      </w:pPr>
-    </w:p>
-    <w:p>
-      <w:pPr>
-        <w:spacing w:line="400" w:lineRule="exact"/>
-        <w:rPr>
-          <w:color w:val="000000"/>
-        </w:rPr>
-      </w:pPr>
-    </w:p>
-    <w:p>
-      <w:pPr>
-        <w:spacing w:line="400" w:lineRule="exact"/>
-        <w:rPr>
-          <w:b/>
-          <w:color w:val="000000"/>
-        </w:rPr>
-      </w:pPr>
-      <w:r>
-        <w:rPr>
-          <w:rFonts w:hint="eastAsia"/>
-          <w:b/>
-          <w:color w:val="000000"/>
-        </w:rPr>
-        <w:t>四、实验中遇到的问题和解决方法以及心得体会</w:t>
-      </w:r>
-    </w:p>
-    <w:p>
-      <w:pPr>
-        <w:spacing w:line="400" w:lineRule="exact"/>
-        <w:rPr>
-          <w:rFonts w:cs="宋体"/>
-          <w:kern w:val="0"/>
-          <w:szCs w:val="21"/>
-        </w:rPr>
-      </w:pPr>
-      <w:r>
-        <w:rPr>
-          <w:rFonts w:cs="宋体" w:hint="eastAsia"/>
-          <w:kern w:val="0"/>
-          <w:szCs w:val="21"/>
-        </w:rPr>
-        <w:t>(1)  DROP</w:t>
-      </w:r>
-      <w:r>
-        <w:rPr>
-          <w:rFonts w:cs="宋体" w:hint="eastAsia"/>
-          <w:kern w:val="0"/>
-          <w:szCs w:val="21"/>
-        </w:rPr>
-        <w:t>命令和</w:t>
-      </w:r>
-      <w:r>
-        <w:rPr>
-          <w:rFonts w:cs="宋体" w:hint="eastAsia"/>
-          <w:kern w:val="0"/>
-          <w:szCs w:val="21"/>
-        </w:rPr>
-        <w:t>DELETE</w:t>
-      </w:r>
-      <w:r>
-        <w:rPr>
-          <w:rFonts w:cs="宋体" w:hint="eastAsia"/>
-          <w:kern w:val="0"/>
-          <w:szCs w:val="21"/>
-        </w:rPr>
-        <w:t>命令的本质区别是什么？</w:t>
-      </w:r>
-    </w:p>
-    <w:p>
-      <w:pPr>
-        <w:spacing w:line="400" w:lineRule="exact"/>
-        <w:rPr>
-          <w:rFonts w:cs="宋体"/>
-          <w:kern w:val="0"/>
-          <w:szCs w:val="21"/>
-        </w:rPr>
-      </w:pPr>
-    </w:p>
-    <w:p>
-      <w:pPr>
-        <w:spacing w:line="400" w:lineRule="exact"/>
-        <w:rPr>
-          <w:rFonts w:cs="宋体"/>
-          <w:kern w:val="0"/>
-          <w:szCs w:val="21"/>
-        </w:rPr>
-      </w:pPr>
-      <w:r>
-        <w:rPr>
-          <w:rFonts w:cs="宋体" w:hint="eastAsia"/>
-          <w:kern w:val="0"/>
-          <w:szCs w:val="21"/>
-        </w:rPr>
-        <w:t xml:space="preserve">(2) </w:t>
-      </w:r>
-      <w:r>
-        <w:rPr>
-          <w:rFonts w:cs="宋体" w:hint="eastAsia"/>
-          <w:kern w:val="0"/>
-          <w:szCs w:val="21"/>
-        </w:rPr>
-        <w:t>利用</w:t>
-      </w:r>
-      <w:r>
-        <w:rPr>
-          <w:rFonts w:cs="宋体" w:hint="eastAsia"/>
-          <w:kern w:val="0"/>
-          <w:szCs w:val="21"/>
-        </w:rPr>
-        <w:t>INSERT</w:t>
+        <w:t>向视图中插入的数据能进入到基本表中去吗？</w:t>
+      </w:r>
+    </w:p>
+    <w:p>
+      <w:pPr>
+        <w:spacing w:line="400" w:lineRule="exact"/>
+        <w:rPr>
+          <w:rFonts w:cs="宋体"/>
+          <w:kern w:val="0"/>
+          <w:szCs w:val="21"/>
+        </w:rPr>
+      </w:pPr>
+      <w:r>
+        <w:rPr>
+          <w:rFonts w:cs="宋体" w:hint="eastAsia"/>
+          <w:kern w:val="0"/>
+          <w:szCs w:val="21"/>
+        </w:rPr>
+        <w:t>答：</w:t>
+      </w:r>
+      <w:r>
+        <w:rPr>
+          <w:rFonts w:cs="宋体" w:hint="eastAsia"/>
+          <w:kern w:val="0"/>
+          <w:szCs w:val="21"/>
+        </w:rPr>
+        <w:t>可以。但前提是这个视图是“可更新视图”。如果你的视图仅仅是简单的</w:t>
+      </w:r>
+      <w:r>
+        <w:rPr>
+          <w:rFonts w:cs="宋体" w:hint="eastAsia"/>
+          <w:kern w:val="0"/>
+          <w:szCs w:val="21"/>
+        </w:rPr>
+        <w:t xml:space="preserve"> SELECT </w:t>
+      </w:r>
+      <w:r>
+        <w:rPr>
+          <w:rFonts w:cs="宋体" w:hint="eastAsia"/>
+          <w:kern w:val="0"/>
+          <w:szCs w:val="21"/>
+        </w:rPr>
+        <w:t>部分列（如</w:t>
+      </w:r>
+      <w:r>
+        <w:rPr>
+          <w:rFonts w:cs="宋体" w:hint="eastAsia"/>
+          <w:kern w:val="0"/>
+          <w:szCs w:val="21"/>
+        </w:rPr>
+        <w:t xml:space="preserve"> sc_view2</w:t>
+      </w:r>
+      <w:r>
+        <w:rPr>
+          <w:rFonts w:cs="宋体" w:hint="eastAsia"/>
+          <w:kern w:val="0"/>
+          <w:szCs w:val="21"/>
+        </w:rPr>
+        <w:t>），那么执行</w:t>
+      </w:r>
+      <w:r>
+        <w:rPr>
+          <w:rFonts w:cs="宋体" w:hint="eastAsia"/>
+          <w:kern w:val="0"/>
+          <w:szCs w:val="21"/>
+        </w:rPr>
+        <w:t xml:space="preserve"> INSERT </w:t>
+      </w:r>
+      <w:r>
+        <w:rPr>
+          <w:rFonts w:cs="宋体" w:hint="eastAsia"/>
+          <w:kern w:val="0"/>
+          <w:szCs w:val="21"/>
+        </w:rPr>
+        <w:t>或</w:t>
+      </w:r>
+      <w:r>
+        <w:rPr>
+          <w:rFonts w:cs="宋体" w:hint="eastAsia"/>
+          <w:kern w:val="0"/>
+          <w:szCs w:val="21"/>
+        </w:rPr>
+        <w:t xml:space="preserve"> UPDATE </w:t>
+      </w:r>
+      <w:r>
+        <w:rPr>
+          <w:rFonts w:cs="宋体" w:hint="eastAsia"/>
+          <w:kern w:val="0"/>
+          <w:szCs w:val="21"/>
+        </w:rPr>
+        <w:t>操作会直接反映到底层的</w:t>
+      </w:r>
+      <w:r>
+        <w:rPr>
+          <w:rFonts w:cs="宋体" w:hint="eastAsia"/>
+          <w:kern w:val="0"/>
+          <w:szCs w:val="21"/>
+        </w:rPr>
+        <w:t xml:space="preserve"> sc </w:t>
+      </w:r>
+      <w:r>
+        <w:rPr>
+          <w:rFonts w:cs="宋体" w:hint="eastAsia"/>
+          <w:kern w:val="0"/>
+          <w:szCs w:val="21"/>
+        </w:rPr>
+        <w:t>基本表中。但如果视图里包含了聚合函数（如</w:t>
+      </w:r>
+      <w:r>
+        <w:rPr>
+          <w:rFonts w:cs="宋体" w:hint="eastAsia"/>
+          <w:kern w:val="0"/>
+          <w:szCs w:val="21"/>
+        </w:rPr>
+        <w:t>SUM</w:t>
+      </w:r>
+      <w:r>
+        <w:rPr>
+          <w:rFonts w:cs="宋体" w:hint="eastAsia"/>
+          <w:kern w:val="0"/>
+          <w:szCs w:val="21"/>
+        </w:rPr>
+        <w:t>）、</w:t>
+      </w:r>
+      <w:r>
+        <w:rPr>
+          <w:rFonts w:cs="宋体" w:hint="eastAsia"/>
+          <w:kern w:val="0"/>
+          <w:szCs w:val="21"/>
+        </w:rPr>
+        <w:t>DISTINCT</w:t>
       </w:r>
       <w:r>
         <w:rPr>
@@ -6693,138 +7979,22 @@
           <w:kern w:val="0"/>
           <w:szCs w:val="21"/>
         </w:rPr>
-        <w:t>UPDATE</w:t>
-      </w:r>
-      <w:r>
-        <w:rPr>
-          <w:rFonts w:cs="宋体" w:hint="eastAsia"/>
-          <w:kern w:val="0"/>
-          <w:szCs w:val="21"/>
-        </w:rPr>
-        <w:t>和</w:t>
-      </w:r>
-      <w:r>
-        <w:rPr>
-          <w:rFonts w:cs="宋体" w:hint="eastAsia"/>
-          <w:kern w:val="0"/>
-          <w:szCs w:val="21"/>
-        </w:rPr>
-        <w:t>DELETE</w:t>
-      </w:r>
-      <w:r>
-        <w:rPr>
-          <w:rFonts w:cs="宋体" w:hint="eastAsia"/>
-          <w:kern w:val="0"/>
-          <w:szCs w:val="21"/>
-        </w:rPr>
-        <w:t>命令可以同时对多个表进行操作吗？</w:t>
-      </w:r>
-    </w:p>
-    <w:p>
-      <w:pPr>
-        <w:spacing w:line="400" w:lineRule="exact"/>
-        <w:rPr>
-          <w:rFonts w:cs="宋体"/>
-          <w:kern w:val="0"/>
-          <w:szCs w:val="21"/>
-        </w:rPr>
-      </w:pPr>
-    </w:p>
-    <w:p>
-      <w:pPr>
-        <w:spacing w:line="400" w:lineRule="exact"/>
-        <w:rPr>
-          <w:rFonts w:cs="宋体"/>
-          <w:kern w:val="0"/>
-          <w:szCs w:val="21"/>
-        </w:rPr>
-      </w:pPr>
-      <w:r>
-        <w:rPr>
-          <w:rFonts w:cs="宋体" w:hint="eastAsia"/>
-          <w:kern w:val="0"/>
-          <w:szCs w:val="21"/>
-        </w:rPr>
-        <w:t xml:space="preserve">(3) </w:t>
-      </w:r>
-      <w:r>
-        <w:rPr>
-          <w:rFonts w:cs="宋体" w:hint="eastAsia"/>
-          <w:kern w:val="0"/>
-          <w:szCs w:val="21"/>
-        </w:rPr>
-        <w:t>视图上</w:t>
-      </w:r>
-      <w:r>
-        <w:rPr>
-          <w:rFonts w:cs="宋体" w:hint="eastAsia"/>
-          <w:kern w:val="0"/>
-          <w:szCs w:val="21"/>
-        </w:rPr>
-        <w:t>能创建索引吗？</w:t>
-      </w:r>
-    </w:p>
-    <w:p>
-      <w:pPr>
-        <w:spacing w:line="400" w:lineRule="exact"/>
-        <w:rPr>
-          <w:rFonts w:cs="宋体"/>
-          <w:kern w:val="0"/>
-          <w:szCs w:val="21"/>
-        </w:rPr>
-      </w:pPr>
-    </w:p>
-    <w:p>
-      <w:pPr>
-        <w:spacing w:line="400" w:lineRule="exact"/>
-        <w:rPr>
-          <w:rFonts w:cs="宋体"/>
-          <w:kern w:val="0"/>
-          <w:szCs w:val="21"/>
-        </w:rPr>
-      </w:pPr>
-    </w:p>
-    <w:p>
-      <w:pPr>
-        <w:spacing w:line="400" w:lineRule="exact"/>
-        <w:rPr>
-          <w:rFonts w:cs="宋体"/>
-          <w:kern w:val="0"/>
-          <w:szCs w:val="21"/>
-        </w:rPr>
-      </w:pPr>
-      <w:r>
-        <w:rPr>
-          <w:rFonts w:cs="宋体" w:hint="eastAsia"/>
-          <w:kern w:val="0"/>
-          <w:szCs w:val="21"/>
-        </w:rPr>
-        <w:t xml:space="preserve">(4) </w:t>
-      </w:r>
-      <w:r>
-        <w:rPr>
-          <w:rFonts w:cs="宋体" w:hint="eastAsia"/>
-          <w:kern w:val="0"/>
-          <w:szCs w:val="21"/>
-        </w:rPr>
-        <w:t>向视图中插入的数据能进入到基本表中去吗？</w:t>
-      </w:r>
-    </w:p>
-    <w:p>
-      <w:pPr>
-        <w:spacing w:line="400" w:lineRule="exact"/>
-        <w:rPr>
-          <w:rFonts w:cs="宋体"/>
-          <w:kern w:val="0"/>
-          <w:szCs w:val="21"/>
-        </w:rPr>
-      </w:pPr>
-    </w:p>
-    <w:p>
-      <w:pPr>
-        <w:spacing w:line="400" w:lineRule="exact"/>
-        <w:rPr>
-          <w:rFonts w:cs="宋体"/>
+        <w:t xml:space="preserve">GROUP BY </w:t>
+      </w:r>
+      <w:r>
+        <w:rPr>
+          <w:rFonts w:cs="宋体" w:hint="eastAsia"/>
+          <w:kern w:val="0"/>
+          <w:szCs w:val="21"/>
+        </w:rPr>
+        <w:t>或是多表连接，这个视图就是不可更新的。</w:t>
+      </w:r>
+    </w:p>
+    <w:p>
+      <w:pPr>
+        <w:spacing w:line="400" w:lineRule="exact"/>
+        <w:rPr>
+          <w:rFonts w:cs="宋体" w:hint="eastAsia"/>
           <w:kern w:val="0"/>
           <w:szCs w:val="21"/>
         </w:rPr>
@@ -6858,13 +8028,28 @@
     </w:p>
     <w:p>
       <w:pPr>
-        <w:spacing w:line="400" w:lineRule="exact"/>
-        <w:ind w:firstLine="420"/>
-        <w:rPr>
-          <w:bCs/>
-          <w:color w:val="000000"/>
-        </w:rPr>
-      </w:pPr>
+        <w:rPr>
+          <w:rFonts w:cs="宋体" w:hint="eastAsia"/>
+          <w:kern w:val="0"/>
+          <w:szCs w:val="21"/>
+        </w:rPr>
+      </w:pPr>
+      <w:r>
+        <w:rPr>
+          <w:rFonts w:cs="宋体" w:hint="eastAsia"/>
+          <w:kern w:val="0"/>
+          <w:szCs w:val="21"/>
+        </w:rPr>
+        <w:t>答：</w:t>
+      </w:r>
+      <w:r>
+        <w:rPr>
+          <w:rFonts w:cs="宋体" w:hint="eastAsia"/>
+          <w:kern w:val="0"/>
+          <w:szCs w:val="21"/>
+        </w:rPr>
+        <w:t>会自动反映。因为视图不存数据，当你查询视图时，数据库引擎会临时去底层的“基本表”拉取最新数据。所以基本表的数据一改，再查视图时，结果自然就变了。</w:t>
+      </w:r>
     </w:p>
     <w:sectPr>
       <w:pgSz w:w="11906" w:h="16838"/>
@@ -7196,7 +8381,6 @@
     <w:lsdException w:name="Table Web 1" w:semiHidden="1" w:unhideWhenUsed="1"/>
     <w:lsdException w:name="Table Web 2" w:semiHidden="1" w:unhideWhenUsed="1"/>
     <w:lsdException w:name="Table Web 3" w:semiHidden="1" w:unhideWhenUsed="1"/>
-    <w:lsdException w:name="Table Grid" w:semiHidden="1" w:unhideWhenUsed="1"/>
     <w:lsdException w:name="Table Theme" w:semiHidden="1" w:unhideWhenUsed="1"/>
     <w:lsdException w:name="Placeholder Text" w:semiHidden="1" w:uiPriority="99"/>
     <w:lsdException w:name="No Spacing" w:uiPriority="99"/>

</xml_diff>